<commit_message>
docs(AOFP-202): add report 5 test documentation and review 2 PDFs
</commit_message>
<xml_diff>
--- a/docs/review-2/source/SWP490_FA26SE036_R2_DesignBrief_BM01.docx
+++ b/docs/review-2/source/SWP490_FA26SE036_R2_DesignBrief_BM01.docx
@@ -38,23 +38,8 @@
     </w:p>
     <w:p>
       <w:pPr>
-        <w:spacing w:after="80"/>
-      </w:pPr>
-      <w:r>
-        <w:rPr>
-          <w:rFonts w:ascii="Calibri" w:cs="Calibri" w:eastAsia="Calibri" w:hAnsi="Calibri"/>
-          <w:i/>
-          <w:iCs/>
-          <w:color w:val="666666"/>
-          <w:sz w:val="19"/>
-          <w:szCs w:val="19"/>
-        </w:rPr>
-        <w:t xml:space="preserve">Form BM01. Sections 0–8: maximum 4 A4 pages (font 11, margins 2 cm). Appendix A is not counted. Remove all grey guidance text and example rows, then export to PDF. File name: SWP490_&lt;ProjectCode&gt;_R2_DesignBrief.pdf</w:t>
-      </w:r>
-    </w:p>
-    <w:p>
-      <w:pPr>
         <w:pStyle w:val="Heading2"/>
+        <w:keepNext/>
         <w:spacing w:after="100" w:before="240"/>
       </w:pPr>
       <w:r>
@@ -558,6 +543,7 @@
     <w:p>
       <w:pPr>
         <w:pStyle w:val="Heading2"/>
+        <w:keepNext/>
         <w:spacing w:after="100" w:before="240"/>
       </w:pPr>
       <w:r>
@@ -575,6 +561,7 @@
     <w:p>
       <w:pPr>
         <w:pStyle w:val="Heading3"/>
+        <w:keepNext/>
         <w:spacing w:after="80" w:before="160"/>
       </w:pPr>
       <w:r>
@@ -586,22 +573,6 @@
           <w:szCs w:val="22"/>
         </w:rPr>
         <w:t xml:space="preserve">1.1 Registration Changes</w:t>
-      </w:r>
-    </w:p>
-    <w:p>
-      <w:pPr>
-        <w:spacing w:after="80"/>
-      </w:pPr>
-      <w:r>
-        <w:rPr>
-          <w:rFonts w:ascii="Calibri" w:cs="Calibri" w:eastAsia="Calibri" w:hAnsi="Calibri"/>
-          <w:i/>
-          <w:iCs/>
-          <w:color w:val="666666"/>
-          <w:sz w:val="19"/>
-          <w:szCs w:val="19"/>
-        </w:rPr>
-        <w:t xml:space="preserve">Summary only; details in Form BM03 (Record of Changes). Write "No changes" if none.</w:t>
       </w:r>
     </w:p>
     <w:tbl>
@@ -777,6 +748,9 @@
             </w:tcMar>
           </w:tcPr>
           <w:p>
+            <w:pPr>
+              <w:keepNext/>
+            </w:pPr>
             <w:r>
               <w:rPr>
                 <w:rFonts w:ascii="Calibri" w:cs="Calibri" w:eastAsia="Calibri" w:hAnsi="Calibri"/>
@@ -907,6 +881,9 @@
             </w:tcMar>
           </w:tcPr>
           <w:p>
+            <w:pPr>
+              <w:keepNext/>
+            </w:pPr>
             <w:r>
               <w:rPr>
                 <w:rFonts w:ascii="Calibri" w:cs="Calibri" w:eastAsia="Calibri" w:hAnsi="Calibri"/>
@@ -1037,6 +1014,9 @@
             </w:tcMar>
           </w:tcPr>
           <w:p>
+            <w:pPr>
+              <w:keepNext/>
+            </w:pPr>
             <w:r>
               <w:rPr>
                 <w:rFonts w:ascii="Calibri" w:cs="Calibri" w:eastAsia="Calibri" w:hAnsi="Calibri"/>
@@ -1145,6 +1125,139 @@
                 <w:szCs w:val="19"/>
               </w:rPr>
               <w:t>BM03 #2</w:t>
+            </w:r>
+          </w:p>
+        </w:tc>
+      </w:tr>
+      <w:tr>
+        <w:tc>
+          <w:tcPr>
+            <w:tcW w:type="dxa" w:w="1752"/>
+            <w:tcBorders>
+              <w:top w:val="single" w:color="D9D4CA" w:sz="4"/>
+              <w:left w:val="single" w:color="D9D4CA" w:sz="4"/>
+              <w:bottom w:val="single" w:color="D9D4CA" w:sz="4"/>
+              <w:right w:val="single" w:color="D9D4CA" w:sz="4"/>
+            </w:tcBorders>
+            <w:tcMar>
+              <w:top w:type="dxa" w:w="60"/>
+              <w:left w:type="dxa" w:w="80"/>
+              <w:bottom w:type="dxa" w:w="60"/>
+              <w:right w:type="dxa" w:w="80"/>
+            </w:tcMar>
+          </w:tcPr>
+          <w:p>
+            <w:pPr>
+              <w:keepNext/>
+            </w:pPr>
+            <w:r>
+              <w:rPr>
+                <w:rFonts w:ascii="Calibri" w:cs="Calibri" w:eastAsia="Calibri" w:hAnsi="Calibri"/>
+                <w:b w:val="false"/>
+                <w:bCs w:val="false"/>
+                <w:i w:val="0"/>
+                <w:iCs w:val="false"/>
+                <w:color w:val="000000"/>
+                <w:sz w:val="16"/>
+                <w:szCs w:val="19"/>
+              </w:rPr>
+              <w:t xml:space="preserve">3.2 Suggested technologies</w:t>
+            </w:r>
+          </w:p>
+        </w:tc>
+        <w:tc>
+          <w:tcPr>
+            <w:tcW w:type="dxa" w:w="2628"/>
+            <w:tcBorders>
+              <w:top w:val="single" w:color="D9D4CA" w:sz="4"/>
+              <w:left w:val="single" w:color="D9D4CA" w:sz="4"/>
+              <w:bottom w:val="single" w:color="D9D4CA" w:sz="4"/>
+              <w:right w:val="single" w:color="D9D4CA" w:sz="4"/>
+            </w:tcBorders>
+            <w:tcMar>
+              <w:top w:type="dxa" w:w="60"/>
+              <w:left w:type="dxa" w:w="80"/>
+              <w:bottom w:type="dxa" w:w="60"/>
+              <w:right w:type="dxa" w:w="80"/>
+            </w:tcMar>
+          </w:tcPr>
+          <w:p>
+            <w:r>
+              <w:rPr>
+                <w:rFonts w:ascii="Calibri" w:cs="Calibri" w:eastAsia="Calibri" w:hAnsi="Calibri"/>
+                <w:b w:val="false"/>
+                <w:bCs w:val="false"/>
+                <w:i w:val="0"/>
+                <w:iCs w:val="false"/>
+                <w:color w:val="000000"/>
+                <w:sz w:val="16"/>
+                <w:szCs w:val="19"/>
+              </w:rPr>
+              <w:t xml:space="preserve">Spring Boot, PostgreSQL, Apache Kafka (suggested)</w:t>
+            </w:r>
+          </w:p>
+        </w:tc>
+        <w:tc>
+          <w:tcPr>
+            <w:tcW w:type="dxa" w:w="2628"/>
+            <w:tcBorders>
+              <w:top w:val="single" w:color="D9D4CA" w:sz="4"/>
+              <w:left w:val="single" w:color="D9D4CA" w:sz="4"/>
+              <w:bottom w:val="single" w:color="D9D4CA" w:sz="4"/>
+              <w:right w:val="single" w:color="D9D4CA" w:sz="4"/>
+            </w:tcBorders>
+            <w:tcMar>
+              <w:top w:type="dxa" w:w="60"/>
+              <w:left w:type="dxa" w:w="80"/>
+              <w:bottom w:type="dxa" w:w="60"/>
+              <w:right w:type="dxa" w:w="80"/>
+            </w:tcMar>
+          </w:tcPr>
+          <w:p>
+            <w:r>
+              <w:rPr>
+                <w:rFonts w:ascii="Calibri" w:cs="Calibri" w:eastAsia="Calibri" w:hAnsi="Calibri"/>
+                <w:b w:val="false"/>
+                <w:bCs w:val="false"/>
+                <w:i w:val="0"/>
+                <w:iCs w:val="false"/>
+                <w:color w:val="000000"/>
+                <w:sz w:val="16"/>
+                <w:szCs w:val="19"/>
+              </w:rPr>
+              <w:t xml:space="preserve">NestJS, MongoDB, scheduled jobs + webhooks + outbox; ReactJS, Redis, Docker, OR-Tools, LLM API (Groq) kept; Next.js added</w:t>
+            </w:r>
+          </w:p>
+        </w:tc>
+        <w:tc>
+          <w:tcPr>
+            <w:tcW w:type="dxa" w:w="2630"/>
+            <w:tcBorders>
+              <w:top w:val="single" w:color="D9D4CA" w:sz="4"/>
+              <w:left w:val="single" w:color="D9D4CA" w:sz="4"/>
+              <w:bottom w:val="single" w:color="D9D4CA" w:sz="4"/>
+              <w:right w:val="single" w:color="D9D4CA" w:sz="4"/>
+            </w:tcBorders>
+            <w:tcMar>
+              <w:top w:type="dxa" w:w="60"/>
+              <w:left w:type="dxa" w:w="80"/>
+              <w:bottom w:type="dxa" w:w="60"/>
+              <w:right w:type="dxa" w:w="80"/>
+            </w:tcMar>
+          </w:tcPr>
+          <w:p>
+            <w:r>
+              <w:rPr>
+                <w:rFonts w:ascii="Calibri" w:cs="Calibri" w:eastAsia="Calibri" w:hAnsi="Calibri"/>
+                <w:b w:val="false"/>
+                <w:bCs w:val="false"/>
+                <w:i w:val="0"/>
+                <w:iCs w:val="false"/>
+                <w:color w:val="000000"/>
+                <w:sz w:val="16"/>
+                <w:szCs w:val="19"/>
+              </w:rPr>
+              <w:t xml:space="preserve">BM03 #3</w:t>
             </w:r>
           </w:p>
         </w:tc>
@@ -1153,6 +1266,7 @@
     <w:p>
       <w:pPr>
         <w:pStyle w:val="Heading3"/>
+        <w:keepNext/>
         <w:spacing w:after="80" w:before="160"/>
       </w:pPr>
       <w:r>
@@ -1521,6 +1635,7 @@
     <w:p>
       <w:pPr>
         <w:pStyle w:val="Heading2"/>
+        <w:keepNext/>
         <w:spacing w:after="100" w:before="240"/>
       </w:pPr>
       <w:r>
@@ -1533,22 +1648,6 @@
           <w:szCs w:val="24"/>
         </w:rPr>
         <w:t xml:space="preserve">2. System at a Glance</w:t>
-      </w:r>
-    </w:p>
-    <w:p>
-      <w:pPr>
-        <w:spacing w:after="80"/>
-      </w:pPr>
-      <w:r>
-        <w:rPr>
-          <w:rFonts w:ascii="Calibri" w:cs="Calibri" w:eastAsia="Calibri" w:hAnsi="Calibri"/>
-          <w:i/>
-          <w:iCs/>
-          <w:color w:val="666666"/>
-          <w:sz w:val="19"/>
-          <w:szCs w:val="19"/>
-        </w:rPr>
-        <w:t xml:space="preserve">Maximum 150 words: the problem, the users, the core value. Link to the architecture diagram in the SDD.</w:t>
       </w:r>
     </w:p>
     <w:p>
@@ -1570,6 +1669,7 @@
     <w:p>
       <w:pPr>
         <w:pStyle w:val="Heading2"/>
+        <w:keepNext/>
         <w:spacing w:after="100" w:before="240"/>
       </w:pPr>
       <w:r>
@@ -1582,22 +1682,6 @@
           <w:szCs w:val="24"/>
         </w:rPr>
         <w:t xml:space="preserve">3. Key Design Decisions</w:t>
-      </w:r>
-    </w:p>
-    <w:p>
-      <w:pPr>
-        <w:spacing w:after="80"/>
-      </w:pPr>
-      <w:r>
-        <w:rPr>
-          <w:rFonts w:ascii="Calibri" w:cs="Calibri" w:eastAsia="Calibri" w:hAnsi="Calibri"/>
-          <w:i/>
-          <w:iCs/>
-          <w:color w:val="666666"/>
-          <w:sz w:val="19"/>
-          <w:szCs w:val="19"/>
-        </w:rPr>
-        <w:t xml:space="preserve">Exactly 5 decisions. Each must have one owner.</w:t>
       </w:r>
     </w:p>
     <w:tbl>
@@ -1980,7 +2064,7 @@
                 <w:sz w:val="16"/>
                 <w:szCs w:val="19"/>
               </w:rPr>
-              <w:t>[Owner]</w:t>
+              <w:t>Thuận</w:t>
             </w:r>
           </w:p>
         </w:tc>
@@ -2174,7 +2258,7 @@
                 <w:sz w:val="16"/>
                 <w:szCs w:val="19"/>
               </w:rPr>
-              <w:t>[Owner]</w:t>
+              <w:t>Thi</w:t>
             </w:r>
           </w:p>
         </w:tc>
@@ -2368,7 +2452,7 @@
                 <w:sz w:val="16"/>
                 <w:szCs w:val="19"/>
               </w:rPr>
-              <w:t>[Owner]</w:t>
+              <w:t>Thuận</w:t>
             </w:r>
           </w:p>
         </w:tc>
@@ -2562,7 +2646,7 @@
                 <w:sz w:val="16"/>
                 <w:szCs w:val="19"/>
               </w:rPr>
-              <w:t>[Owner]</w:t>
+              <w:t>Thuận</w:t>
             </w:r>
           </w:p>
         </w:tc>
@@ -2756,7 +2840,7 @@
                 <w:sz w:val="16"/>
                 <w:szCs w:val="19"/>
               </w:rPr>
-              <w:t>[Owner]</w:t>
+              <w:t>Thuận</w:t>
             </w:r>
           </w:p>
         </w:tc>
@@ -2797,6 +2881,7 @@
     <w:p>
       <w:pPr>
         <w:pStyle w:val="Heading2"/>
+        <w:keepNext/>
         <w:spacing w:after="100" w:before="240"/>
       </w:pPr>
       <w:r>
@@ -3157,7 +3242,7 @@
                 <w:sz w:val="16"/>
                 <w:szCs w:val="19"/>
               </w:rPr>
-              <w:t>[Owner]</w:t>
+              <w:t>Thuận</w:t>
             </w:r>
           </w:p>
         </w:tc>
@@ -3319,7 +3404,7 @@
                 <w:sz w:val="16"/>
                 <w:szCs w:val="19"/>
               </w:rPr>
-              <w:t>[Owner]</w:t>
+              <w:t>Thuận</w:t>
             </w:r>
           </w:p>
         </w:tc>
@@ -3481,7 +3566,7 @@
                 <w:sz w:val="16"/>
                 <w:szCs w:val="19"/>
               </w:rPr>
-              <w:t>[Owner]</w:t>
+              <w:t>Thi</w:t>
             </w:r>
           </w:p>
         </w:tc>
@@ -3490,6 +3575,7 @@
     <w:p>
       <w:pPr>
         <w:pStyle w:val="Heading2"/>
+        <w:keepNext/>
         <w:spacing w:after="100" w:before="240"/>
       </w:pPr>
       <w:r>
@@ -3502,22 +3588,6 @@
           <w:szCs w:val="24"/>
         </w:rPr>
         <w:t xml:space="preserve">5. Known Gaps</w:t>
-      </w:r>
-    </w:p>
-    <w:p>
-      <w:pPr>
-        <w:spacing w:after="80"/>
-      </w:pPr>
-      <w:r>
-        <w:rPr>
-          <w:rFonts w:ascii="Calibri" w:cs="Calibri" w:eastAsia="Calibri" w:hAnsi="Calibri"/>
-          <w:i/>
-          <w:iCs/>
-          <w:color w:val="666666"/>
-          <w:sz w:val="19"/>
-          <w:szCs w:val="19"/>
-        </w:rPr>
-        <w:t xml:space="preserve">Mismatches between the registration form, SRS, SDD and code. Include every High finding marked Kept or Planned in Form BM02.</w:t>
       </w:r>
     </w:p>
     <w:tbl>
@@ -3833,7 +3903,7 @@
                 <w:sz w:val="19"/>
                 <w:szCs w:val="19"/>
               </w:rPr>
-              <w:t xml:space="preserve">Registration 3.2; Report 1 FE-06; SDD 1.1</w:t>
+              <w:t xml:space="preserve">Registration 3.2; Report 1 FE-06; SDD 1.1; BM02 F01</w:t>
             </w:r>
           </w:p>
         </w:tc>
@@ -3895,7 +3965,7 @@
                 <w:sz w:val="19"/>
                 <w:szCs w:val="19"/>
               </w:rPr>
-              <w:t xml:space="preserve">[Owner]</w:t>
+              <w:t xml:space="preserve">Việt</w:t>
             </w:r>
           </w:p>
         </w:tc>
@@ -4083,7 +4153,7 @@
                 <w:sz w:val="19"/>
                 <w:szCs w:val="19"/>
               </w:rPr>
-              <w:t xml:space="preserve">[Owner]</w:t>
+              <w:t xml:space="preserve">Thuận</w:t>
             </w:r>
           </w:p>
         </w:tc>
@@ -4271,7 +4341,7 @@
                 <w:sz w:val="19"/>
                 <w:szCs w:val="19"/>
               </w:rPr>
-              <w:t xml:space="preserve">[Owner]</w:t>
+              <w:t xml:space="preserve">Thuận</w:t>
             </w:r>
           </w:p>
         </w:tc>
@@ -4459,7 +4529,7 @@
                 <w:sz w:val="19"/>
                 <w:szCs w:val="19"/>
               </w:rPr>
-              <w:t xml:space="preserve">[Owner]</w:t>
+              <w:t xml:space="preserve">Thi</w:t>
             </w:r>
           </w:p>
         </w:tc>
@@ -4647,7 +4717,7 @@
                 <w:sz w:val="19"/>
                 <w:szCs w:val="19"/>
               </w:rPr>
-              <w:t xml:space="preserve">[Owner]</w:t>
+              <w:t xml:space="preserve">Thi</w:t>
             </w:r>
           </w:p>
         </w:tc>
@@ -4679,6 +4749,758 @@
                 <w:szCs w:val="19"/>
               </w:rPr>
               <w:t xml:space="preserve">20/11/2026</w:t>
+            </w:r>
+          </w:p>
+        </w:tc>
+      </w:tr>
+      <w:tr>
+        <w:tc>
+          <w:tcPr>
+            <w:tcW w:type="dxa" w:w="642"/>
+            <w:tcBorders>
+              <w:top w:val="single" w:color="D9D4CA" w:sz="4"/>
+              <w:left w:val="single" w:color="D9D4CA" w:sz="4"/>
+              <w:bottom w:val="single" w:color="D9D4CA" w:sz="4"/>
+              <w:right w:val="single" w:color="D9D4CA" w:sz="4"/>
+            </w:tcBorders>
+            <w:tcMar>
+              <w:top w:type="dxa" w:w="60"/>
+              <w:left w:type="dxa" w:w="80"/>
+              <w:bottom w:type="dxa" w:w="60"/>
+              <w:right w:type="dxa" w:w="80"/>
+            </w:tcMar>
+          </w:tcPr>
+          <w:p>
+            <w:r>
+              <w:rPr>
+                <w:rFonts w:ascii="Calibri" w:cs="Calibri" w:eastAsia="Calibri" w:hAnsi="Calibri"/>
+                <w:b w:val="false"/>
+                <w:bCs w:val="false"/>
+                <w:i w:val="false"/>
+                <w:iCs w:val="false"/>
+                <w:sz w:val="19"/>
+                <w:szCs w:val="19"/>
+              </w:rPr>
+              <w:t xml:space="preserve">G6</w:t>
+            </w:r>
+          </w:p>
+        </w:tc>
+        <w:tc>
+          <w:tcPr>
+            <w:tcW w:type="dxa" w:w="2570"/>
+            <w:tcBorders>
+              <w:top w:val="single" w:color="D9D4CA" w:sz="4"/>
+              <w:left w:val="single" w:color="D9D4CA" w:sz="4"/>
+              <w:bottom w:val="single" w:color="D9D4CA" w:sz="4"/>
+              <w:right w:val="single" w:color="D9D4CA" w:sz="4"/>
+            </w:tcBorders>
+            <w:tcMar>
+              <w:top w:type="dxa" w:w="60"/>
+              <w:left w:type="dxa" w:w="80"/>
+              <w:bottom w:type="dxa" w:w="60"/>
+              <w:right w:type="dxa" w:w="80"/>
+            </w:tcMar>
+          </w:tcPr>
+          <w:p>
+            <w:r>
+              <w:rPr>
+                <w:rFonts w:ascii="Calibri" w:cs="Calibri" w:eastAsia="Calibri" w:hAnsi="Calibri"/>
+                <w:b w:val="false"/>
+                <w:bCs w:val="false"/>
+                <w:i w:val="false"/>
+                <w:iCs w:val="false"/>
+                <w:sz w:val="19"/>
+                <w:szCs w:val="19"/>
+              </w:rPr>
+              <w:t xml:space="preserve">Registration: merge orders across platforms; the system groups orders only within one shop (BM02 F02, Kept)</w:t>
+            </w:r>
+          </w:p>
+        </w:tc>
+        <w:tc>
+          <w:tcPr>
+            <w:tcW w:type="dxa" w:w="1927"/>
+            <w:tcBorders>
+              <w:top w:val="single" w:color="D9D4CA" w:sz="4"/>
+              <w:left w:val="single" w:color="D9D4CA" w:sz="4"/>
+              <w:bottom w:val="single" w:color="D9D4CA" w:sz="4"/>
+              <w:right w:val="single" w:color="D9D4CA" w:sz="4"/>
+            </w:tcBorders>
+            <w:tcMar>
+              <w:top w:type="dxa" w:w="60"/>
+              <w:left w:type="dxa" w:w="80"/>
+              <w:bottom w:type="dxa" w:w="60"/>
+              <w:right w:type="dxa" w:w="80"/>
+            </w:tcMar>
+          </w:tcPr>
+          <w:p>
+            <w:r>
+              <w:rPr>
+                <w:rFonts w:ascii="Calibri" w:cs="Calibri" w:eastAsia="Calibri" w:hAnsi="Calibri"/>
+                <w:b w:val="false"/>
+                <w:bCs w:val="false"/>
+                <w:i w:val="false"/>
+                <w:iCs w:val="false"/>
+                <w:sz w:val="19"/>
+                <w:szCs w:val="19"/>
+              </w:rPr>
+              <w:t xml:space="preserve">Registration 3.1; SRS BR-01</w:t>
+            </w:r>
+          </w:p>
+        </w:tc>
+        <w:tc>
+          <w:tcPr>
+            <w:tcW w:type="dxa" w:w="1927"/>
+            <w:tcBorders>
+              <w:top w:val="single" w:color="D9D4CA" w:sz="4"/>
+              <w:left w:val="single" w:color="D9D4CA" w:sz="4"/>
+              <w:bottom w:val="single" w:color="D9D4CA" w:sz="4"/>
+              <w:right w:val="single" w:color="D9D4CA" w:sz="4"/>
+            </w:tcBorders>
+            <w:tcMar>
+              <w:top w:type="dxa" w:w="60"/>
+              <w:left w:type="dxa" w:w="80"/>
+              <w:bottom w:type="dxa" w:w="60"/>
+              <w:right w:type="dxa" w:w="80"/>
+            </w:tcMar>
+          </w:tcPr>
+          <w:p>
+            <w:r>
+              <w:rPr>
+                <w:rFonts w:ascii="Calibri" w:cs="Calibri" w:eastAsia="Calibri" w:hAnsi="Calibri"/>
+                <w:b w:val="false"/>
+                <w:bCs w:val="false"/>
+                <w:i w:val="false"/>
+                <w:iCs w:val="false"/>
+                <w:sz w:val="19"/>
+                <w:szCs w:val="19"/>
+              </w:rPr>
+              <w:t xml:space="preserve">Kept: each platform has its own carrier order; same-recipient groups can be linked (UC-16); confirm wording with reviewers</w:t>
+            </w:r>
+          </w:p>
+        </w:tc>
+        <w:tc>
+          <w:tcPr>
+            <w:tcW w:type="dxa" w:w="1285"/>
+            <w:tcBorders>
+              <w:top w:val="single" w:color="D9D4CA" w:sz="4"/>
+              <w:left w:val="single" w:color="D9D4CA" w:sz="4"/>
+              <w:bottom w:val="single" w:color="D9D4CA" w:sz="4"/>
+              <w:right w:val="single" w:color="D9D4CA" w:sz="4"/>
+            </w:tcBorders>
+            <w:tcMar>
+              <w:top w:type="dxa" w:w="60"/>
+              <w:left w:type="dxa" w:w="80"/>
+              <w:bottom w:type="dxa" w:w="60"/>
+              <w:right w:type="dxa" w:w="80"/>
+            </w:tcMar>
+          </w:tcPr>
+          <w:p>
+            <w:r>
+              <w:rPr>
+                <w:rFonts w:ascii="Calibri" w:cs="Calibri" w:eastAsia="Calibri" w:hAnsi="Calibri"/>
+                <w:b w:val="false"/>
+                <w:bCs w:val="false"/>
+                <w:i w:val="false"/>
+                <w:iCs w:val="false"/>
+                <w:sz w:val="19"/>
+                <w:szCs w:val="19"/>
+              </w:rPr>
+              <w:t xml:space="preserve">Thuận</w:t>
+            </w:r>
+          </w:p>
+        </w:tc>
+        <w:tc>
+          <w:tcPr>
+            <w:tcW w:type="dxa" w:w="1287"/>
+            <w:tcBorders>
+              <w:top w:val="single" w:color="D9D4CA" w:sz="4"/>
+              <w:left w:val="single" w:color="D9D4CA" w:sz="4"/>
+              <w:bottom w:val="single" w:color="D9D4CA" w:sz="4"/>
+              <w:right w:val="single" w:color="D9D4CA" w:sz="4"/>
+            </w:tcBorders>
+            <w:tcMar>
+              <w:top w:type="dxa" w:w="60"/>
+              <w:left w:type="dxa" w:w="80"/>
+              <w:bottom w:type="dxa" w:w="60"/>
+              <w:right w:type="dxa" w:w="80"/>
+            </w:tcMar>
+          </w:tcPr>
+          <w:p>
+            <w:r>
+              <w:rPr>
+                <w:rFonts w:ascii="Calibri" w:cs="Calibri" w:eastAsia="Calibri" w:hAnsi="Calibri"/>
+                <w:b w:val="false"/>
+                <w:bCs w:val="false"/>
+                <w:i w:val="false"/>
+                <w:iCs w:val="false"/>
+                <w:sz w:val="19"/>
+                <w:szCs w:val="19"/>
+              </w:rPr>
+              <w:t xml:space="preserve">Review 2 session</w:t>
+            </w:r>
+          </w:p>
+        </w:tc>
+      </w:tr>
+      <w:tr>
+        <w:tc>
+          <w:tcPr>
+            <w:tcW w:type="dxa" w:w="642"/>
+            <w:tcBorders>
+              <w:top w:val="single" w:color="D9D4CA" w:sz="4"/>
+              <w:left w:val="single" w:color="D9D4CA" w:sz="4"/>
+              <w:bottom w:val="single" w:color="D9D4CA" w:sz="4"/>
+              <w:right w:val="single" w:color="D9D4CA" w:sz="4"/>
+            </w:tcBorders>
+            <w:tcMar>
+              <w:top w:type="dxa" w:w="60"/>
+              <w:left w:type="dxa" w:w="80"/>
+              <w:bottom w:type="dxa" w:w="60"/>
+              <w:right w:type="dxa" w:w="80"/>
+            </w:tcMar>
+          </w:tcPr>
+          <w:p>
+            <w:r>
+              <w:rPr>
+                <w:rFonts w:ascii="Calibri" w:cs="Calibri" w:eastAsia="Calibri" w:hAnsi="Calibri"/>
+                <w:b w:val="false"/>
+                <w:bCs w:val="false"/>
+                <w:i w:val="false"/>
+                <w:iCs w:val="false"/>
+                <w:sz w:val="19"/>
+                <w:szCs w:val="19"/>
+              </w:rPr>
+              <w:t xml:space="preserve">G7</w:t>
+            </w:r>
+          </w:p>
+        </w:tc>
+        <w:tc>
+          <w:tcPr>
+            <w:tcW w:type="dxa" w:w="2570"/>
+            <w:tcBorders>
+              <w:top w:val="single" w:color="D9D4CA" w:sz="4"/>
+              <w:left w:val="single" w:color="D9D4CA" w:sz="4"/>
+              <w:bottom w:val="single" w:color="D9D4CA" w:sz="4"/>
+              <w:right w:val="single" w:color="D9D4CA" w:sz="4"/>
+            </w:tcBorders>
+            <w:tcMar>
+              <w:top w:type="dxa" w:w="60"/>
+              <w:left w:type="dxa" w:w="80"/>
+              <w:bottom w:type="dxa" w:w="60"/>
+              <w:right w:type="dxa" w:w="80"/>
+            </w:tcMar>
+          </w:tcPr>
+          <w:p>
+            <w:r>
+              <w:rPr>
+                <w:rFonts w:ascii="Calibri" w:cs="Calibri" w:eastAsia="Calibri" w:hAnsi="Calibri"/>
+                <w:b w:val="false"/>
+                <w:bCs w:val="false"/>
+                <w:i w:val="false"/>
+                <w:iCs w:val="false"/>
+                <w:sz w:val="19"/>
+                <w:szCs w:val="19"/>
+              </w:rPr>
+              <w:t xml:space="preserve">No state machine for Packing Plan, Shipment, Return Request, Order (BM02 F03)</w:t>
+            </w:r>
+          </w:p>
+        </w:tc>
+        <w:tc>
+          <w:tcPr>
+            <w:tcW w:type="dxa" w:w="1927"/>
+            <w:tcBorders>
+              <w:top w:val="single" w:color="D9D4CA" w:sz="4"/>
+              <w:left w:val="single" w:color="D9D4CA" w:sz="4"/>
+              <w:bottom w:val="single" w:color="D9D4CA" w:sz="4"/>
+              <w:right w:val="single" w:color="D9D4CA" w:sz="4"/>
+            </w:tcBorders>
+            <w:tcMar>
+              <w:top w:type="dxa" w:w="60"/>
+              <w:left w:type="dxa" w:w="80"/>
+              <w:bottom w:type="dxa" w:w="60"/>
+              <w:right w:type="dxa" w:w="80"/>
+            </w:tcMar>
+          </w:tcPr>
+          <w:p>
+            <w:r>
+              <w:rPr>
+                <w:rFonts w:ascii="Calibri" w:cs="Calibri" w:eastAsia="Calibri" w:hAnsi="Calibri"/>
+                <w:b w:val="false"/>
+                <w:bCs w:val="false"/>
+                <w:i w:val="false"/>
+                <w:iCs w:val="false"/>
+                <w:sz w:val="19"/>
+                <w:szCs w:val="19"/>
+              </w:rPr>
+              <w:t xml:space="preserve">SDD 3.8</w:t>
+            </w:r>
+          </w:p>
+        </w:tc>
+        <w:tc>
+          <w:tcPr>
+            <w:tcW w:type="dxa" w:w="1927"/>
+            <w:tcBorders>
+              <w:top w:val="single" w:color="D9D4CA" w:sz="4"/>
+              <w:left w:val="single" w:color="D9D4CA" w:sz="4"/>
+              <w:bottom w:val="single" w:color="D9D4CA" w:sz="4"/>
+              <w:right w:val="single" w:color="D9D4CA" w:sz="4"/>
+            </w:tcBorders>
+            <w:tcMar>
+              <w:top w:type="dxa" w:w="60"/>
+              <w:left w:type="dxa" w:w="80"/>
+              <w:bottom w:type="dxa" w:w="60"/>
+              <w:right w:type="dxa" w:w="80"/>
+            </w:tcMar>
+          </w:tcPr>
+          <w:p>
+            <w:r>
+              <w:rPr>
+                <w:rFonts w:ascii="Calibri" w:cs="Calibri" w:eastAsia="Calibri" w:hAnsi="Calibri"/>
+                <w:b w:val="false"/>
+                <w:bCs w:val="false"/>
+                <w:i w:val="false"/>
+                <w:iCs w:val="false"/>
+                <w:sz w:val="19"/>
+                <w:szCs w:val="19"/>
+              </w:rPr>
+              <w:t xml:space="preserve">Draw them in PlantUML from the status enums</w:t>
+            </w:r>
+          </w:p>
+        </w:tc>
+        <w:tc>
+          <w:tcPr>
+            <w:tcW w:type="dxa" w:w="1285"/>
+            <w:tcBorders>
+              <w:top w:val="single" w:color="D9D4CA" w:sz="4"/>
+              <w:left w:val="single" w:color="D9D4CA" w:sz="4"/>
+              <w:bottom w:val="single" w:color="D9D4CA" w:sz="4"/>
+              <w:right w:val="single" w:color="D9D4CA" w:sz="4"/>
+            </w:tcBorders>
+            <w:tcMar>
+              <w:top w:type="dxa" w:w="60"/>
+              <w:left w:type="dxa" w:w="80"/>
+              <w:bottom w:type="dxa" w:w="60"/>
+              <w:right w:type="dxa" w:w="80"/>
+            </w:tcMar>
+          </w:tcPr>
+          <w:p>
+            <w:r>
+              <w:rPr>
+                <w:rFonts w:ascii="Calibri" w:cs="Calibri" w:eastAsia="Calibri" w:hAnsi="Calibri"/>
+                <w:b w:val="false"/>
+                <w:bCs w:val="false"/>
+                <w:i w:val="false"/>
+                <w:iCs w:val="false"/>
+                <w:sz w:val="19"/>
+                <w:szCs w:val="19"/>
+              </w:rPr>
+              <w:t xml:space="preserve">Thuận</w:t>
+            </w:r>
+          </w:p>
+        </w:tc>
+        <w:tc>
+          <w:tcPr>
+            <w:tcW w:type="dxa" w:w="1287"/>
+            <w:tcBorders>
+              <w:top w:val="single" w:color="D9D4CA" w:sz="4"/>
+              <w:left w:val="single" w:color="D9D4CA" w:sz="4"/>
+              <w:bottom w:val="single" w:color="D9D4CA" w:sz="4"/>
+              <w:right w:val="single" w:color="D9D4CA" w:sz="4"/>
+            </w:tcBorders>
+            <w:tcMar>
+              <w:top w:type="dxa" w:w="60"/>
+              <w:left w:type="dxa" w:w="80"/>
+              <w:bottom w:type="dxa" w:w="60"/>
+              <w:right w:type="dxa" w:w="80"/>
+            </w:tcMar>
+          </w:tcPr>
+          <w:p>
+            <w:r>
+              <w:rPr>
+                <w:rFonts w:ascii="Calibri" w:cs="Calibri" w:eastAsia="Calibri" w:hAnsi="Calibri"/>
+                <w:b w:val="false"/>
+                <w:bCs w:val="false"/>
+                <w:i w:val="false"/>
+                <w:iCs w:val="false"/>
+                <w:sz w:val="19"/>
+                <w:szCs w:val="19"/>
+              </w:rPr>
+              <w:t xml:space="preserve">08/11/2026</w:t>
+            </w:r>
+          </w:p>
+        </w:tc>
+      </w:tr>
+      <w:tr>
+        <w:tc>
+          <w:tcPr>
+            <w:tcW w:type="dxa" w:w="642"/>
+            <w:tcBorders>
+              <w:top w:val="single" w:color="D9D4CA" w:sz="4"/>
+              <w:left w:val="single" w:color="D9D4CA" w:sz="4"/>
+              <w:bottom w:val="single" w:color="D9D4CA" w:sz="4"/>
+              <w:right w:val="single" w:color="D9D4CA" w:sz="4"/>
+            </w:tcBorders>
+            <w:tcMar>
+              <w:top w:type="dxa" w:w="60"/>
+              <w:left w:type="dxa" w:w="80"/>
+              <w:bottom w:type="dxa" w:w="60"/>
+              <w:right w:type="dxa" w:w="80"/>
+            </w:tcMar>
+          </w:tcPr>
+          <w:p>
+            <w:r>
+              <w:rPr>
+                <w:rFonts w:ascii="Calibri" w:cs="Calibri" w:eastAsia="Calibri" w:hAnsi="Calibri"/>
+                <w:b w:val="false"/>
+                <w:bCs w:val="false"/>
+                <w:i w:val="false"/>
+                <w:iCs w:val="false"/>
+                <w:sz w:val="19"/>
+                <w:szCs w:val="19"/>
+              </w:rPr>
+              <w:t xml:space="preserve">G8</w:t>
+            </w:r>
+          </w:p>
+        </w:tc>
+        <w:tc>
+          <w:tcPr>
+            <w:tcW w:type="dxa" w:w="2570"/>
+            <w:tcBorders>
+              <w:top w:val="single" w:color="D9D4CA" w:sz="4"/>
+              <w:left w:val="single" w:color="D9D4CA" w:sz="4"/>
+              <w:bottom w:val="single" w:color="D9D4CA" w:sz="4"/>
+              <w:right w:val="single" w:color="D9D4CA" w:sz="4"/>
+            </w:tcBorders>
+            <w:tcMar>
+              <w:top w:type="dxa" w:w="60"/>
+              <w:left w:type="dxa" w:w="80"/>
+              <w:bottom w:type="dxa" w:w="60"/>
+              <w:right w:type="dxa" w:w="80"/>
+            </w:tcMar>
+          </w:tcPr>
+          <w:p>
+            <w:r>
+              <w:rPr>
+                <w:rFonts w:ascii="Calibri" w:cs="Calibri" w:eastAsia="Calibri" w:hAnsi="Calibri"/>
+                <w:b w:val="false"/>
+                <w:bCs w:val="false"/>
+                <w:i w:val="false"/>
+                <w:iCs w:val="false"/>
+                <w:sz w:val="19"/>
+                <w:szCs w:val="19"/>
+              </w:rPr>
+              <w:t xml:space="preserve">Architecture diagram shows a mobile app; misses AURELLE website, Open API simulator, Google OAuth, SMTP (BM02 F04)</w:t>
+            </w:r>
+          </w:p>
+        </w:tc>
+        <w:tc>
+          <w:tcPr>
+            <w:tcW w:type="dxa" w:w="1927"/>
+            <w:tcBorders>
+              <w:top w:val="single" w:color="D9D4CA" w:sz="4"/>
+              <w:left w:val="single" w:color="D9D4CA" w:sz="4"/>
+              <w:bottom w:val="single" w:color="D9D4CA" w:sz="4"/>
+              <w:right w:val="single" w:color="D9D4CA" w:sz="4"/>
+            </w:tcBorders>
+            <w:tcMar>
+              <w:top w:type="dxa" w:w="60"/>
+              <w:left w:type="dxa" w:w="80"/>
+              <w:bottom w:type="dxa" w:w="60"/>
+              <w:right w:type="dxa" w:w="80"/>
+            </w:tcMar>
+          </w:tcPr>
+          <w:p>
+            <w:r>
+              <w:rPr>
+                <w:rFonts w:ascii="Calibri" w:cs="Calibri" w:eastAsia="Calibri" w:hAnsi="Calibri"/>
+                <w:b w:val="false"/>
+                <w:bCs w:val="false"/>
+                <w:i w:val="false"/>
+                <w:iCs w:val="false"/>
+                <w:sz w:val="19"/>
+                <w:szCs w:val="19"/>
+              </w:rPr>
+              <w:t xml:space="preserve">SDD Figure 1</w:t>
+            </w:r>
+          </w:p>
+        </w:tc>
+        <w:tc>
+          <w:tcPr>
+            <w:tcW w:type="dxa" w:w="1927"/>
+            <w:tcBorders>
+              <w:top w:val="single" w:color="D9D4CA" w:sz="4"/>
+              <w:left w:val="single" w:color="D9D4CA" w:sz="4"/>
+              <w:bottom w:val="single" w:color="D9D4CA" w:sz="4"/>
+              <w:right w:val="single" w:color="D9D4CA" w:sz="4"/>
+            </w:tcBorders>
+            <w:tcMar>
+              <w:top w:type="dxa" w:w="60"/>
+              <w:left w:type="dxa" w:w="80"/>
+              <w:bottom w:type="dxa" w:w="60"/>
+              <w:right w:type="dxa" w:w="80"/>
+            </w:tcMar>
+          </w:tcPr>
+          <w:p>
+            <w:r>
+              <w:rPr>
+                <w:rFonts w:ascii="Calibri" w:cs="Calibri" w:eastAsia="Calibri" w:hAnsi="Calibri"/>
+                <w:b w:val="false"/>
+                <w:bCs w:val="false"/>
+                <w:i w:val="false"/>
+                <w:iCs w:val="false"/>
+                <w:sz w:val="19"/>
+                <w:szCs w:val="19"/>
+              </w:rPr>
+              <w:t xml:space="preserve">Update the .puml to match SDD 1.1 and re-export</w:t>
+            </w:r>
+          </w:p>
+        </w:tc>
+        <w:tc>
+          <w:tcPr>
+            <w:tcW w:type="dxa" w:w="1285"/>
+            <w:tcBorders>
+              <w:top w:val="single" w:color="D9D4CA" w:sz="4"/>
+              <w:left w:val="single" w:color="D9D4CA" w:sz="4"/>
+              <w:bottom w:val="single" w:color="D9D4CA" w:sz="4"/>
+              <w:right w:val="single" w:color="D9D4CA" w:sz="4"/>
+            </w:tcBorders>
+            <w:tcMar>
+              <w:top w:type="dxa" w:w="60"/>
+              <w:left w:type="dxa" w:w="80"/>
+              <w:bottom w:type="dxa" w:w="60"/>
+              <w:right w:type="dxa" w:w="80"/>
+            </w:tcMar>
+          </w:tcPr>
+          <w:p>
+            <w:r>
+              <w:rPr>
+                <w:rFonts w:ascii="Calibri" w:cs="Calibri" w:eastAsia="Calibri" w:hAnsi="Calibri"/>
+                <w:b w:val="false"/>
+                <w:bCs w:val="false"/>
+                <w:i w:val="false"/>
+                <w:iCs w:val="false"/>
+                <w:sz w:val="19"/>
+                <w:szCs w:val="19"/>
+              </w:rPr>
+              <w:t xml:space="preserve">Thuận</w:t>
+            </w:r>
+          </w:p>
+        </w:tc>
+        <w:tc>
+          <w:tcPr>
+            <w:tcW w:type="dxa" w:w="1287"/>
+            <w:tcBorders>
+              <w:top w:val="single" w:color="D9D4CA" w:sz="4"/>
+              <w:left w:val="single" w:color="D9D4CA" w:sz="4"/>
+              <w:bottom w:val="single" w:color="D9D4CA" w:sz="4"/>
+              <w:right w:val="single" w:color="D9D4CA" w:sz="4"/>
+            </w:tcBorders>
+            <w:tcMar>
+              <w:top w:type="dxa" w:w="60"/>
+              <w:left w:type="dxa" w:w="80"/>
+              <w:bottom w:type="dxa" w:w="60"/>
+              <w:right w:type="dxa" w:w="80"/>
+            </w:tcMar>
+          </w:tcPr>
+          <w:p>
+            <w:r>
+              <w:rPr>
+                <w:rFonts w:ascii="Calibri" w:cs="Calibri" w:eastAsia="Calibri" w:hAnsi="Calibri"/>
+                <w:b w:val="false"/>
+                <w:bCs w:val="false"/>
+                <w:i w:val="false"/>
+                <w:iCs w:val="false"/>
+                <w:sz w:val="19"/>
+                <w:szCs w:val="19"/>
+              </w:rPr>
+              <w:t xml:space="preserve">08/11/2026</w:t>
+            </w:r>
+          </w:p>
+        </w:tc>
+      </w:tr>
+      <w:tr>
+        <w:tc>
+          <w:tcPr>
+            <w:tcW w:type="dxa" w:w="642"/>
+            <w:tcBorders>
+              <w:top w:val="single" w:color="D9D4CA" w:sz="4"/>
+              <w:left w:val="single" w:color="D9D4CA" w:sz="4"/>
+              <w:bottom w:val="single" w:color="D9D4CA" w:sz="4"/>
+              <w:right w:val="single" w:color="D9D4CA" w:sz="4"/>
+            </w:tcBorders>
+            <w:tcMar>
+              <w:top w:type="dxa" w:w="60"/>
+              <w:left w:type="dxa" w:w="80"/>
+              <w:bottom w:type="dxa" w:w="60"/>
+              <w:right w:type="dxa" w:w="80"/>
+            </w:tcMar>
+          </w:tcPr>
+          <w:p>
+            <w:r>
+              <w:rPr>
+                <w:rFonts w:ascii="Calibri" w:cs="Calibri" w:eastAsia="Calibri" w:hAnsi="Calibri"/>
+                <w:b w:val="false"/>
+                <w:bCs w:val="false"/>
+                <w:i w:val="false"/>
+                <w:iCs w:val="false"/>
+                <w:sz w:val="19"/>
+                <w:szCs w:val="19"/>
+              </w:rPr>
+              <w:t xml:space="preserve">G9</w:t>
+            </w:r>
+          </w:p>
+        </w:tc>
+        <w:tc>
+          <w:tcPr>
+            <w:tcW w:type="dxa" w:w="2570"/>
+            <w:tcBorders>
+              <w:top w:val="single" w:color="D9D4CA" w:sz="4"/>
+              <w:left w:val="single" w:color="D9D4CA" w:sz="4"/>
+              <w:bottom w:val="single" w:color="D9D4CA" w:sz="4"/>
+              <w:right w:val="single" w:color="D9D4CA" w:sz="4"/>
+            </w:tcBorders>
+            <w:tcMar>
+              <w:top w:type="dxa" w:w="60"/>
+              <w:left w:type="dxa" w:w="80"/>
+              <w:bottom w:type="dxa" w:w="60"/>
+              <w:right w:type="dxa" w:w="80"/>
+            </w:tcMar>
+          </w:tcPr>
+          <w:p>
+            <w:r>
+              <w:rPr>
+                <w:rFonts w:ascii="Calibri" w:cs="Calibri" w:eastAsia="Calibri" w:hAnsi="Calibri"/>
+                <w:b w:val="false"/>
+                <w:bCs w:val="false"/>
+                <w:i w:val="false"/>
+                <w:iCs w:val="false"/>
+                <w:sz w:val="19"/>
+                <w:szCs w:val="19"/>
+              </w:rPr>
+              <w:t xml:space="preserve">Logical ERD misses main entities of the SRS entity table (BM02 F05)</w:t>
+            </w:r>
+          </w:p>
+        </w:tc>
+        <w:tc>
+          <w:tcPr>
+            <w:tcW w:type="dxa" w:w="1927"/>
+            <w:tcBorders>
+              <w:top w:val="single" w:color="D9D4CA" w:sz="4"/>
+              <w:left w:val="single" w:color="D9D4CA" w:sz="4"/>
+              <w:bottom w:val="single" w:color="D9D4CA" w:sz="4"/>
+              <w:right w:val="single" w:color="D9D4CA" w:sz="4"/>
+            </w:tcBorders>
+            <w:tcMar>
+              <w:top w:type="dxa" w:w="60"/>
+              <w:left w:type="dxa" w:w="80"/>
+              <w:bottom w:type="dxa" w:w="60"/>
+              <w:right w:type="dxa" w:w="80"/>
+            </w:tcMar>
+          </w:tcPr>
+          <w:p>
+            <w:r>
+              <w:rPr>
+                <w:rFonts w:ascii="Calibri" w:cs="Calibri" w:eastAsia="Calibri" w:hAnsi="Calibri"/>
+                <w:b w:val="false"/>
+                <w:bCs w:val="false"/>
+                <w:i w:val="false"/>
+                <w:iCs w:val="false"/>
+                <w:sz w:val="19"/>
+                <w:szCs w:val="19"/>
+              </w:rPr>
+              <w:t xml:space="preserve">SDD Figure 3</w:t>
+            </w:r>
+          </w:p>
+        </w:tc>
+        <w:tc>
+          <w:tcPr>
+            <w:tcW w:type="dxa" w:w="1927"/>
+            <w:tcBorders>
+              <w:top w:val="single" w:color="D9D4CA" w:sz="4"/>
+              <w:left w:val="single" w:color="D9D4CA" w:sz="4"/>
+              <w:bottom w:val="single" w:color="D9D4CA" w:sz="4"/>
+              <w:right w:val="single" w:color="D9D4CA" w:sz="4"/>
+            </w:tcBorders>
+            <w:tcMar>
+              <w:top w:type="dxa" w:w="60"/>
+              <w:left w:type="dxa" w:w="80"/>
+              <w:bottom w:type="dxa" w:w="60"/>
+              <w:right w:type="dxa" w:w="80"/>
+            </w:tcMar>
+          </w:tcPr>
+          <w:p>
+            <w:r>
+              <w:rPr>
+                <w:rFonts w:ascii="Calibri" w:cs="Calibri" w:eastAsia="Calibri" w:hAnsi="Calibri"/>
+                <w:b w:val="false"/>
+                <w:bCs w:val="false"/>
+                <w:i w:val="false"/>
+                <w:iCs w:val="false"/>
+                <w:sz w:val="19"/>
+                <w:szCs w:val="19"/>
+              </w:rPr>
+              <w:t xml:space="preserve">Add all main collections to erd.puml; add a database script</w:t>
+            </w:r>
+          </w:p>
+        </w:tc>
+        <w:tc>
+          <w:tcPr>
+            <w:tcW w:type="dxa" w:w="1285"/>
+            <w:tcBorders>
+              <w:top w:val="single" w:color="D9D4CA" w:sz="4"/>
+              <w:left w:val="single" w:color="D9D4CA" w:sz="4"/>
+              <w:bottom w:val="single" w:color="D9D4CA" w:sz="4"/>
+              <w:right w:val="single" w:color="D9D4CA" w:sz="4"/>
+            </w:tcBorders>
+            <w:tcMar>
+              <w:top w:type="dxa" w:w="60"/>
+              <w:left w:type="dxa" w:w="80"/>
+              <w:bottom w:type="dxa" w:w="60"/>
+              <w:right w:type="dxa" w:w="80"/>
+            </w:tcMar>
+          </w:tcPr>
+          <w:p>
+            <w:r>
+              <w:rPr>
+                <w:rFonts w:ascii="Calibri" w:cs="Calibri" w:eastAsia="Calibri" w:hAnsi="Calibri"/>
+                <w:b w:val="false"/>
+                <w:bCs w:val="false"/>
+                <w:i w:val="false"/>
+                <w:iCs w:val="false"/>
+                <w:sz w:val="19"/>
+                <w:szCs w:val="19"/>
+              </w:rPr>
+              <w:t xml:space="preserve">Thi</w:t>
+            </w:r>
+          </w:p>
+        </w:tc>
+        <w:tc>
+          <w:tcPr>
+            <w:tcW w:type="dxa" w:w="1287"/>
+            <w:tcBorders>
+              <w:top w:val="single" w:color="D9D4CA" w:sz="4"/>
+              <w:left w:val="single" w:color="D9D4CA" w:sz="4"/>
+              <w:bottom w:val="single" w:color="D9D4CA" w:sz="4"/>
+              <w:right w:val="single" w:color="D9D4CA" w:sz="4"/>
+            </w:tcBorders>
+            <w:tcMar>
+              <w:top w:type="dxa" w:w="60"/>
+              <w:left w:type="dxa" w:w="80"/>
+              <w:bottom w:type="dxa" w:w="60"/>
+              <w:right w:type="dxa" w:w="80"/>
+            </w:tcMar>
+          </w:tcPr>
+          <w:p>
+            <w:r>
+              <w:rPr>
+                <w:rFonts w:ascii="Calibri" w:cs="Calibri" w:eastAsia="Calibri" w:hAnsi="Calibri"/>
+                <w:b w:val="false"/>
+                <w:bCs w:val="false"/>
+                <w:i w:val="false"/>
+                <w:iCs w:val="false"/>
+                <w:sz w:val="19"/>
+                <w:szCs w:val="19"/>
+              </w:rPr>
+              <w:t xml:space="preserve">15/11/2026</w:t>
             </w:r>
           </w:p>
         </w:tc>
@@ -4687,6 +5509,7 @@
     <w:p>
       <w:pPr>
         <w:pStyle w:val="Heading2"/>
+        <w:keepNext/>
         <w:spacing w:after="100" w:before="240"/>
       </w:pPr>
       <w:r>
@@ -4699,22 +5522,6 @@
           <w:szCs w:val="24"/>
         </w:rPr>
         <w:t xml:space="preserve">6. Proposed Mandatory Features</w:t>
-      </w:r>
-    </w:p>
-    <w:p>
-      <w:pPr>
-        <w:spacing w:after="80"/>
-      </w:pPr>
-      <w:r>
-        <w:rPr>
-          <w:rFonts w:ascii="Calibri" w:cs="Calibri" w:eastAsia="Calibri" w:hAnsi="Calibri"/>
-          <w:i/>
-          <w:iCs/>
-          <w:color w:val="666666"/>
-          <w:sz w:val="19"/>
-          <w:szCs w:val="19"/>
-        </w:rPr>
-        <w:t xml:space="preserve">Within the scope in section 1. Acceptance criteria must be testable with a clear pass/fail result.</w:t>
       </w:r>
     </w:p>
     <w:tbl>
@@ -5097,7 +5904,7 @@
                 <w:sz w:val="16"/>
                 <w:szCs w:val="19"/>
               </w:rPr>
-              <w:t>[TC ids]</w:t>
+              <w:t>TC-F01-01 … TC-F01-03 (Report 5)</w:t>
             </w:r>
           </w:p>
         </w:tc>
@@ -5291,7 +6098,7 @@
                 <w:sz w:val="16"/>
                 <w:szCs w:val="19"/>
               </w:rPr>
-              <w:t>[TC ids]</w:t>
+              <w:t>TC-F02-01 … TC-F02-03 (Report 5)</w:t>
             </w:r>
           </w:p>
         </w:tc>
@@ -5485,7 +6292,7 @@
                 <w:sz w:val="16"/>
                 <w:szCs w:val="19"/>
               </w:rPr>
-              <w:t>[TC ids]</w:t>
+              <w:t>TC-F03-01 … TC-F03-03 (Report 5)</w:t>
             </w:r>
           </w:p>
         </w:tc>
@@ -5679,7 +6486,7 @@
                 <w:sz w:val="16"/>
                 <w:szCs w:val="19"/>
               </w:rPr>
-              <w:t>[TC ids]</w:t>
+              <w:t>TC-F04-01 … TC-F04-03 (Report 5)</w:t>
             </w:r>
           </w:p>
         </w:tc>
@@ -5873,7 +6680,7 @@
                 <w:sz w:val="16"/>
                 <w:szCs w:val="19"/>
               </w:rPr>
-              <w:t>[TC ids]</w:t>
+              <w:t>TC-F05-01 … TC-F05-03 (Report 5)</w:t>
             </w:r>
           </w:p>
         </w:tc>
@@ -6067,7 +6874,7 @@
                 <w:sz w:val="16"/>
                 <w:szCs w:val="19"/>
               </w:rPr>
-              <w:t>[TC ids]</w:t>
+              <w:t>TC-F06-01 … TC-F06-03 (Report 5)</w:t>
             </w:r>
           </w:p>
         </w:tc>
@@ -6261,7 +7068,7 @@
                 <w:sz w:val="16"/>
                 <w:szCs w:val="19"/>
               </w:rPr>
-              <w:t>[TC ids]</w:t>
+              <w:t>TC-F07-01 … TC-F07-03 (Report 5)</w:t>
             </w:r>
           </w:p>
         </w:tc>
@@ -6455,7 +7262,7 @@
                 <w:sz w:val="16"/>
                 <w:szCs w:val="19"/>
               </w:rPr>
-              <w:t>[TC ids]</w:t>
+              <w:t>TC-F08-01 … TC-F08-03 (Report 5)</w:t>
             </w:r>
           </w:p>
         </w:tc>
@@ -6649,7 +7456,7 @@
                 <w:sz w:val="16"/>
                 <w:szCs w:val="19"/>
               </w:rPr>
-              <w:t>[TC ids]</w:t>
+              <w:t>TC-F09-01 … TC-F09-03 (Report 5)</w:t>
             </w:r>
           </w:p>
         </w:tc>
@@ -6843,7 +7650,7 @@
                 <w:sz w:val="16"/>
                 <w:szCs w:val="19"/>
               </w:rPr>
-              <w:t>[TC ids]</w:t>
+              <w:t>TC-F10-01 … TC-F10-03 (Report 5)</w:t>
             </w:r>
           </w:p>
         </w:tc>
@@ -6884,6 +7691,7 @@
     <w:p>
       <w:pPr>
         <w:pStyle w:val="Heading2"/>
+        <w:keepNext/>
         <w:spacing w:after="100" w:before="240"/>
       </w:pPr>
       <w:r>
@@ -6896,22 +7704,6 @@
           <w:szCs w:val="24"/>
         </w:rPr>
         <w:t xml:space="preserve">7. Non-Functional Requirements</w:t>
-      </w:r>
-    </w:p>
-    <w:p>
-      <w:pPr>
-        <w:spacing w:after="80"/>
-      </w:pPr>
-      <w:r>
-        <w:rPr>
-          <w:rFonts w:ascii="Calibri" w:cs="Calibri" w:eastAsia="Calibri" w:hAnsi="Calibri"/>
-          <w:i/>
-          <w:iCs/>
-          <w:color w:val="666666"/>
-          <w:sz w:val="19"/>
-          <w:szCs w:val="19"/>
-        </w:rPr>
-        <w:t xml:space="preserve">Maximum 6 rows. Each NFR needs a metric, a threshold and a measurement method.</w:t>
       </w:r>
     </w:p>
     <w:tbl>
@@ -8079,6 +8871,7 @@
     <w:p>
       <w:pPr>
         <w:pStyle w:val="Heading2"/>
+        <w:keepNext/>
         <w:spacing w:after="100" w:before="240"/>
       </w:pPr>
       <w:r>
@@ -8091,22 +8884,6 @@
           <w:szCs w:val="24"/>
         </w:rPr>
         <w:t xml:space="preserve">8. Ownership Map</w:t>
-      </w:r>
-    </w:p>
-    <w:p>
-      <w:pPr>
-        <w:spacing w:after="80"/>
-      </w:pPr>
-      <w:r>
-        <w:rPr>
-          <w:rFonts w:ascii="Calibri" w:cs="Calibri" w:eastAsia="Calibri" w:hAnsi="Calibri"/>
-          <w:i/>
-          <w:iCs/>
-          <w:color w:val="666666"/>
-          <w:sz w:val="19"/>
-          <w:szCs w:val="19"/>
-        </w:rPr>
-        <w:t xml:space="preserve">One row per member. Each member owns 2–3 parts and at least one main workflow (Appendix A1).</w:t>
       </w:r>
     </w:p>
     <w:tbl>
@@ -8391,7 +9168,7 @@
                 <w:sz w:val="16"/>
                 <w:szCs w:val="19"/>
               </w:rPr>
-              <w:t>[Owned parts]</w:t>
+              <w:t>Marketplace integration and order intake; GHN shipping and AURELLE write-back; architecture, CI/CD, Review 2 documents</w:t>
             </w:r>
           </w:p>
         </w:tc>
@@ -8423,7 +9200,7 @@
                 <w:sz w:val="16"/>
                 <w:szCs w:val="19"/>
               </w:rPr>
-              <w:t>[WF]</w:t>
+              <w:t>WF-01, WF-04</w:t>
             </w:r>
           </w:p>
         </w:tc>
@@ -8455,7 +9232,7 @@
                 <w:sz w:val="16"/>
                 <w:szCs w:val="19"/>
               </w:rPr>
-              <w:t>[Decisions / PRs]</w:t>
+              <w:t>D1, D3–D5; PR #3–#4, #11–#18, #20–#21</w:t>
             </w:r>
           </w:p>
         </w:tc>
@@ -8553,7 +9330,7 @@
                 <w:sz w:val="16"/>
                 <w:szCs w:val="19"/>
               </w:rPr>
-              <w:t>[Owned parts]</w:t>
+              <w:t>Returns and exchanges; stock receiving by lot (FIFO); 3D packing solver</w:t>
             </w:r>
           </w:p>
         </w:tc>
@@ -8585,7 +9362,7 @@
                 <w:sz w:val="16"/>
                 <w:szCs w:val="19"/>
               </w:rPr>
-              <w:t>[WF]</w:t>
+              <w:t>WF-05, WF-06</w:t>
             </w:r>
           </w:p>
         </w:tc>
@@ -8617,7 +9394,7 @@
                 <w:sz w:val="16"/>
                 <w:szCs w:val="19"/>
               </w:rPr>
-              <w:t>[Decisions / PRs]</w:t>
+              <w:t>D2; PR #7</w:t>
             </w:r>
           </w:p>
         </w:tc>
@@ -8715,7 +9492,7 @@
                 <w:sz w:val="16"/>
                 <w:szCs w:val="19"/>
               </w:rPr>
-              <w:t>[Owned parts]</w:t>
+              <w:t>Packing Station UI (3D viewer, plan review, packing session); picking, shipping and returns screens</w:t>
             </w:r>
           </w:p>
         </w:tc>
@@ -8747,7 +9524,7 @@
                 <w:sz w:val="16"/>
                 <w:szCs w:val="19"/>
               </w:rPr>
-              <w:t>[WF]</w:t>
+              <w:t>WF-03</w:t>
             </w:r>
           </w:p>
         </w:tc>
@@ -8779,7 +9556,7 @@
                 <w:sz w:val="16"/>
                 <w:szCs w:val="19"/>
               </w:rPr>
-              <w:t>[Decisions / PRs]</w:t>
+              <w:t>PR #2, #8, #9, #10, #22</w:t>
             </w:r>
           </w:p>
         </w:tc>
@@ -8877,7 +9654,7 @@
                 <w:sz w:val="16"/>
                 <w:szCs w:val="19"/>
               </w:rPr>
-              <w:t>[Owned parts]</w:t>
+              <w:t>Admin portal (accounts, roles, leave); admin warehouse and SKU screens; marketplace connection screens</w:t>
             </w:r>
           </w:p>
         </w:tc>
@@ -8909,7 +9686,7 @@
                 <w:sz w:val="16"/>
                 <w:szCs w:val="19"/>
               </w:rPr>
-              <w:t>[WF]</w:t>
+              <w:t>WF-02</w:t>
             </w:r>
           </w:p>
         </w:tc>
@@ -8941,7 +9718,7 @@
                 <w:sz w:val="16"/>
                 <w:szCs w:val="19"/>
               </w:rPr>
-              <w:t>[Decisions / PRs]</w:t>
+              <w:t>Commits on feature/phuong_admin</w:t>
             </w:r>
           </w:p>
         </w:tc>
@@ -8955,6 +9732,7 @@
     <w:p>
       <w:pPr>
         <w:pStyle w:val="Heading1"/>
+        <w:keepNext/>
         <w:spacing w:after="160" w:before="120"/>
       </w:pPr>
       <w:r>
@@ -8972,6 +9750,7 @@
     <w:p>
       <w:pPr>
         <w:pStyle w:val="Heading3"/>
+        <w:keepNext/>
         <w:spacing w:after="80" w:before="160"/>
       </w:pPr>
       <w:r>
@@ -8983,22 +9762,6 @@
           <w:szCs w:val="22"/>
         </w:rPr>
         <w:t xml:space="preserve">A1. Main Workflows</w:t>
-      </w:r>
-    </w:p>
-    <w:p>
-      <w:pPr>
-        <w:spacing w:after="80"/>
-      </w:pPr>
-      <w:r>
-        <w:rPr>
-          <w:rFonts w:ascii="Calibri" w:cs="Calibri" w:eastAsia="Calibri" w:hAnsi="Calibri"/>
-          <w:i/>
-          <w:iCs/>
-          <w:color w:val="666666"/>
-          <w:sz w:val="19"/>
-          <w:szCs w:val="19"/>
-        </w:rPr>
-        <w:t xml:space="preserve">Minimum number = number of team members. A valid workflow involves at least 2 actors or at least 3 mandatory features, and changes the state of at least one main entity.</w:t>
       </w:r>
     </w:p>
     <w:tbl>
@@ -9545,7 +10308,7 @@
                 <w:sz w:val="15"/>
                 <w:szCs w:val="19"/>
               </w:rPr>
-              <w:t>[Owner]</w:t>
+              <w:t>Thuận</w:t>
             </w:r>
           </w:p>
         </w:tc>
@@ -9803,7 +10566,7 @@
                 <w:sz w:val="15"/>
                 <w:szCs w:val="19"/>
               </w:rPr>
-              <w:t>[Owner]</w:t>
+              <w:t>Phượng</w:t>
             </w:r>
           </w:p>
         </w:tc>
@@ -10061,7 +10824,7 @@
                 <w:sz w:val="15"/>
                 <w:szCs w:val="19"/>
               </w:rPr>
-              <w:t>[Owner]</w:t>
+              <w:t>Việt</w:t>
             </w:r>
           </w:p>
         </w:tc>
@@ -10319,7 +11082,7 @@
                 <w:sz w:val="15"/>
                 <w:szCs w:val="19"/>
               </w:rPr>
-              <w:t>[Owner]</w:t>
+              <w:t>Thuận</w:t>
             </w:r>
           </w:p>
         </w:tc>
@@ -10577,7 +11340,7 @@
                 <w:sz w:val="15"/>
                 <w:szCs w:val="19"/>
               </w:rPr>
-              <w:t>[Owner]</w:t>
+              <w:t>Thi</w:t>
             </w:r>
           </w:p>
         </w:tc>
@@ -10835,7 +11598,7 @@
                 <w:sz w:val="15"/>
                 <w:szCs w:val="19"/>
               </w:rPr>
-              <w:t>[Owner]</w:t>
+              <w:t>Thi</w:t>
             </w:r>
           </w:p>
         </w:tc>
@@ -10844,6 +11607,7 @@
     <w:p>
       <w:pPr>
         <w:pStyle w:val="Heading3"/>
+        <w:keepNext/>
         <w:spacing w:after="80" w:before="160"/>
       </w:pPr>
       <w:r>
@@ -10855,22 +11619,6 @@
           <w:szCs w:val="22"/>
         </w:rPr>
         <w:t xml:space="preserve">A2. Demo Scenarios</w:t>
-      </w:r>
-    </w:p>
-    <w:p>
-      <w:pPr>
-        <w:spacing w:after="80"/>
-      </w:pPr>
-      <w:r>
-        <w:rPr>
-          <w:rFonts w:ascii="Calibri" w:cs="Calibri" w:eastAsia="Calibri" w:hAnsi="Calibri"/>
-          <w:i/>
-          <w:iCs/>
-          <w:color w:val="666666"/>
-          <w:sz w:val="19"/>
-          <w:szCs w:val="19"/>
-        </w:rPr>
-        <w:t xml:space="preserve">Per workflow: at least 1 main scenario and 1 exception scenario. Run on staging with seeded data.</w:t>
       </w:r>
     </w:p>
     <w:tbl>
@@ -11351,7 +12099,7 @@
                 <w:sz w:val="15"/>
                 <w:szCs w:val="19"/>
               </w:rPr>
-              <w:t>[Presenter]</w:t>
+              <w:t>Thuận</w:t>
             </w:r>
           </w:p>
         </w:tc>
@@ -11577,7 +12325,7 @@
                 <w:sz w:val="15"/>
                 <w:szCs w:val="19"/>
               </w:rPr>
-              <w:t>[Presenter]</w:t>
+              <w:t>Thuận</w:t>
             </w:r>
           </w:p>
         </w:tc>
@@ -11803,7 +12551,7 @@
                 <w:sz w:val="15"/>
                 <w:szCs w:val="19"/>
               </w:rPr>
-              <w:t>[Presenter]</w:t>
+              <w:t>Phượng</w:t>
             </w:r>
           </w:p>
         </w:tc>
@@ -12029,7 +12777,7 @@
                 <w:sz w:val="15"/>
                 <w:szCs w:val="19"/>
               </w:rPr>
-              <w:t>[Presenter]</w:t>
+              <w:t>Phượng</w:t>
             </w:r>
           </w:p>
         </w:tc>
@@ -12255,7 +13003,7 @@
                 <w:sz w:val="15"/>
                 <w:szCs w:val="19"/>
               </w:rPr>
-              <w:t>[Presenter]</w:t>
+              <w:t>Việt</w:t>
             </w:r>
           </w:p>
         </w:tc>
@@ -12481,7 +13229,7 @@
                 <w:sz w:val="15"/>
                 <w:szCs w:val="19"/>
               </w:rPr>
-              <w:t>[Presenter]</w:t>
+              <w:t>Việt</w:t>
             </w:r>
           </w:p>
         </w:tc>
@@ -12707,7 +13455,7 @@
                 <w:sz w:val="15"/>
                 <w:szCs w:val="19"/>
               </w:rPr>
-              <w:t>[Presenter]</w:t>
+              <w:t>Thuận</w:t>
             </w:r>
           </w:p>
         </w:tc>
@@ -12933,7 +13681,7 @@
                 <w:sz w:val="15"/>
                 <w:szCs w:val="19"/>
               </w:rPr>
-              <w:t>[Presenter]</w:t>
+              <w:t>Thuận</w:t>
             </w:r>
           </w:p>
         </w:tc>
@@ -13159,7 +13907,7 @@
                 <w:sz w:val="15"/>
                 <w:szCs w:val="19"/>
               </w:rPr>
-              <w:t>[Presenter]</w:t>
+              <w:t>Thi</w:t>
             </w:r>
           </w:p>
         </w:tc>
@@ -13385,7 +14133,7 @@
                 <w:sz w:val="15"/>
                 <w:szCs w:val="19"/>
               </w:rPr>
-              <w:t>[Presenter]</w:t>
+              <w:t>Thi</w:t>
             </w:r>
           </w:p>
         </w:tc>
@@ -13611,7 +14359,7 @@
                 <w:sz w:val="15"/>
                 <w:szCs w:val="19"/>
               </w:rPr>
-              <w:t>[Presenter]</w:t>
+              <w:t>Thi</w:t>
             </w:r>
           </w:p>
         </w:tc>
@@ -13837,7 +14585,7 @@
                 <w:sz w:val="15"/>
                 <w:szCs w:val="19"/>
               </w:rPr>
-              <w:t>[Presenter]</w:t>
+              <w:t>Thi</w:t>
             </w:r>
           </w:p>
         </w:tc>
@@ -13846,6 +14594,7 @@
     <w:p>
       <w:pPr>
         <w:pStyle w:val="Heading3"/>
+        <w:keepNext/>
         <w:spacing w:after="80" w:before="160"/>
       </w:pPr>
       <w:r>
@@ -14335,7 +15084,7 @@
                 <w:sz w:val="16"/>
                 <w:szCs w:val="19"/>
               </w:rPr>
-              <w:t>[count]</w:t>
+              <w:t>33</w:t>
             </w:r>
           </w:p>
         </w:tc>
@@ -14399,7 +15148,7 @@
                 <w:sz w:val="16"/>
                 <w:szCs w:val="19"/>
               </w:rPr>
-              <w:t>[count]</w:t>
+              <w:t>33</w:t>
             </w:r>
           </w:p>
         </w:tc>
@@ -14657,7 +15406,7 @@
                 <w:sz w:val="16"/>
                 <w:szCs w:val="19"/>
               </w:rPr>
-              <w:t>[sum]</w:t>
+              <w:t>75</w:t>
             </w:r>
           </w:p>
         </w:tc>

</xml_diff>

<commit_message>
docs(AOFP-219): sync guides storefront and reports from main
Co-authored-by: Cursor <cursoragent@cursor.com>
</commit_message>
<xml_diff>
--- a/docs/review-2/source/SWP490_FA26SE036_R2_DesignBrief_BM01.docx
+++ b/docs/review-2/source/SWP490_FA26SE036_R2_DesignBrief_BM01.docx
@@ -38,23 +38,8 @@
     </w:p>
     <w:p>
       <w:pPr>
-        <w:spacing w:after="80"/>
-      </w:pPr>
-      <w:r>
-        <w:rPr>
-          <w:rFonts w:ascii="Calibri" w:cs="Calibri" w:eastAsia="Calibri" w:hAnsi="Calibri"/>
-          <w:i/>
-          <w:iCs/>
-          <w:color w:val="666666"/>
-          <w:sz w:val="19"/>
-          <w:szCs w:val="19"/>
-        </w:rPr>
-        <w:t xml:space="preserve">Form BM01. Sections 0–8: maximum 4 A4 pages (font 11, margins 2 cm). Appendix A is not counted. Remove all grey guidance text and example rows, then export to PDF. File name: SWP490_&lt;ProjectCode&gt;_R2_DesignBrief.pdf</w:t>
-      </w:r>
-    </w:p>
-    <w:p>
-      <w:pPr>
         <w:pStyle w:val="Heading2"/>
+        <w:keepNext/>
         <w:spacing w:after="100" w:before="240"/>
       </w:pPr>
       <w:r>
@@ -558,6 +543,7 @@
     <w:p>
       <w:pPr>
         <w:pStyle w:val="Heading2"/>
+        <w:keepNext/>
         <w:spacing w:after="100" w:before="240"/>
       </w:pPr>
       <w:r>
@@ -575,6 +561,7 @@
     <w:p>
       <w:pPr>
         <w:pStyle w:val="Heading3"/>
+        <w:keepNext/>
         <w:spacing w:after="80" w:before="160"/>
       </w:pPr>
       <w:r>
@@ -586,22 +573,6 @@
           <w:szCs w:val="22"/>
         </w:rPr>
         <w:t xml:space="preserve">1.1 Registration Changes</w:t>
-      </w:r>
-    </w:p>
-    <w:p>
-      <w:pPr>
-        <w:spacing w:after="80"/>
-      </w:pPr>
-      <w:r>
-        <w:rPr>
-          <w:rFonts w:ascii="Calibri" w:cs="Calibri" w:eastAsia="Calibri" w:hAnsi="Calibri"/>
-          <w:i/>
-          <w:iCs/>
-          <w:color w:val="666666"/>
-          <w:sz w:val="19"/>
-          <w:szCs w:val="19"/>
-        </w:rPr>
-        <w:t xml:space="preserve">Summary only; details in Form BM03 (Record of Changes). Write "No changes" if none.</w:t>
       </w:r>
     </w:p>
     <w:tbl>
@@ -777,6 +748,9 @@
             </w:tcMar>
           </w:tcPr>
           <w:p>
+            <w:pPr>
+              <w:keepNext/>
+            </w:pPr>
             <w:r>
               <w:rPr>
                 <w:rFonts w:ascii="Calibri" w:cs="Calibri" w:eastAsia="Calibri" w:hAnsi="Calibri"/>
@@ -907,6 +881,9 @@
             </w:tcMar>
           </w:tcPr>
           <w:p>
+            <w:pPr>
+              <w:keepNext/>
+            </w:pPr>
             <w:r>
               <w:rPr>
                 <w:rFonts w:ascii="Calibri" w:cs="Calibri" w:eastAsia="Calibri" w:hAnsi="Calibri"/>
@@ -1037,6 +1014,9 @@
             </w:tcMar>
           </w:tcPr>
           <w:p>
+            <w:pPr>
+              <w:keepNext/>
+            </w:pPr>
             <w:r>
               <w:rPr>
                 <w:rFonts w:ascii="Calibri" w:cs="Calibri" w:eastAsia="Calibri" w:hAnsi="Calibri"/>
@@ -1145,6 +1125,139 @@
                 <w:szCs w:val="19"/>
               </w:rPr>
               <w:t>BM03 #2</w:t>
+            </w:r>
+          </w:p>
+        </w:tc>
+      </w:tr>
+      <w:tr>
+        <w:tc>
+          <w:tcPr>
+            <w:tcW w:type="dxa" w:w="1752"/>
+            <w:tcBorders>
+              <w:top w:val="single" w:color="D9D4CA" w:sz="4"/>
+              <w:left w:val="single" w:color="D9D4CA" w:sz="4"/>
+              <w:bottom w:val="single" w:color="D9D4CA" w:sz="4"/>
+              <w:right w:val="single" w:color="D9D4CA" w:sz="4"/>
+            </w:tcBorders>
+            <w:tcMar>
+              <w:top w:type="dxa" w:w="60"/>
+              <w:left w:type="dxa" w:w="80"/>
+              <w:bottom w:type="dxa" w:w="60"/>
+              <w:right w:type="dxa" w:w="80"/>
+            </w:tcMar>
+          </w:tcPr>
+          <w:p>
+            <w:pPr>
+              <w:keepNext/>
+            </w:pPr>
+            <w:r>
+              <w:rPr>
+                <w:rFonts w:ascii="Calibri" w:cs="Calibri" w:eastAsia="Calibri" w:hAnsi="Calibri"/>
+                <w:b w:val="false"/>
+                <w:bCs w:val="false"/>
+                <w:i w:val="0"/>
+                <w:iCs w:val="false"/>
+                <w:color w:val="000000"/>
+                <w:sz w:val="16"/>
+                <w:szCs w:val="19"/>
+              </w:rPr>
+              <w:t xml:space="preserve">3.2 Suggested technologies</w:t>
+            </w:r>
+          </w:p>
+        </w:tc>
+        <w:tc>
+          <w:tcPr>
+            <w:tcW w:type="dxa" w:w="2628"/>
+            <w:tcBorders>
+              <w:top w:val="single" w:color="D9D4CA" w:sz="4"/>
+              <w:left w:val="single" w:color="D9D4CA" w:sz="4"/>
+              <w:bottom w:val="single" w:color="D9D4CA" w:sz="4"/>
+              <w:right w:val="single" w:color="D9D4CA" w:sz="4"/>
+            </w:tcBorders>
+            <w:tcMar>
+              <w:top w:type="dxa" w:w="60"/>
+              <w:left w:type="dxa" w:w="80"/>
+              <w:bottom w:type="dxa" w:w="60"/>
+              <w:right w:type="dxa" w:w="80"/>
+            </w:tcMar>
+          </w:tcPr>
+          <w:p>
+            <w:r>
+              <w:rPr>
+                <w:rFonts w:ascii="Calibri" w:cs="Calibri" w:eastAsia="Calibri" w:hAnsi="Calibri"/>
+                <w:b w:val="false"/>
+                <w:bCs w:val="false"/>
+                <w:i w:val="0"/>
+                <w:iCs w:val="false"/>
+                <w:color w:val="000000"/>
+                <w:sz w:val="16"/>
+                <w:szCs w:val="19"/>
+              </w:rPr>
+              <w:t xml:space="preserve">Spring Boot, PostgreSQL, Apache Kafka (suggested)</w:t>
+            </w:r>
+          </w:p>
+        </w:tc>
+        <w:tc>
+          <w:tcPr>
+            <w:tcW w:type="dxa" w:w="2628"/>
+            <w:tcBorders>
+              <w:top w:val="single" w:color="D9D4CA" w:sz="4"/>
+              <w:left w:val="single" w:color="D9D4CA" w:sz="4"/>
+              <w:bottom w:val="single" w:color="D9D4CA" w:sz="4"/>
+              <w:right w:val="single" w:color="D9D4CA" w:sz="4"/>
+            </w:tcBorders>
+            <w:tcMar>
+              <w:top w:type="dxa" w:w="60"/>
+              <w:left w:type="dxa" w:w="80"/>
+              <w:bottom w:type="dxa" w:w="60"/>
+              <w:right w:type="dxa" w:w="80"/>
+            </w:tcMar>
+          </w:tcPr>
+          <w:p>
+            <w:r>
+              <w:rPr>
+                <w:rFonts w:ascii="Calibri" w:cs="Calibri" w:eastAsia="Calibri" w:hAnsi="Calibri"/>
+                <w:b w:val="false"/>
+                <w:bCs w:val="false"/>
+                <w:i w:val="0"/>
+                <w:iCs w:val="false"/>
+                <w:color w:val="000000"/>
+                <w:sz w:val="16"/>
+                <w:szCs w:val="19"/>
+              </w:rPr>
+              <w:t xml:space="preserve">NestJS, MongoDB, scheduled jobs + webhooks + outbox; ReactJS, Redis, Docker, OR-Tools, LLM API (Groq) kept; Next.js added</w:t>
+            </w:r>
+          </w:p>
+        </w:tc>
+        <w:tc>
+          <w:tcPr>
+            <w:tcW w:type="dxa" w:w="2630"/>
+            <w:tcBorders>
+              <w:top w:val="single" w:color="D9D4CA" w:sz="4"/>
+              <w:left w:val="single" w:color="D9D4CA" w:sz="4"/>
+              <w:bottom w:val="single" w:color="D9D4CA" w:sz="4"/>
+              <w:right w:val="single" w:color="D9D4CA" w:sz="4"/>
+            </w:tcBorders>
+            <w:tcMar>
+              <w:top w:type="dxa" w:w="60"/>
+              <w:left w:type="dxa" w:w="80"/>
+              <w:bottom w:type="dxa" w:w="60"/>
+              <w:right w:type="dxa" w:w="80"/>
+            </w:tcMar>
+          </w:tcPr>
+          <w:p>
+            <w:r>
+              <w:rPr>
+                <w:rFonts w:ascii="Calibri" w:cs="Calibri" w:eastAsia="Calibri" w:hAnsi="Calibri"/>
+                <w:b w:val="false"/>
+                <w:bCs w:val="false"/>
+                <w:i w:val="0"/>
+                <w:iCs w:val="false"/>
+                <w:color w:val="000000"/>
+                <w:sz w:val="16"/>
+                <w:szCs w:val="19"/>
+              </w:rPr>
+              <w:t xml:space="preserve">BM03 #3</w:t>
             </w:r>
           </w:p>
         </w:tc>
@@ -1153,6 +1266,7 @@
     <w:p>
       <w:pPr>
         <w:pStyle w:val="Heading3"/>
+        <w:keepNext/>
         <w:spacing w:after="80" w:before="160"/>
       </w:pPr>
       <w:r>
@@ -1521,6 +1635,7 @@
     <w:p>
       <w:pPr>
         <w:pStyle w:val="Heading2"/>
+        <w:keepNext/>
         <w:spacing w:after="100" w:before="240"/>
       </w:pPr>
       <w:r>
@@ -1533,22 +1648,6 @@
           <w:szCs w:val="24"/>
         </w:rPr>
         <w:t xml:space="preserve">2. System at a Glance</w:t>
-      </w:r>
-    </w:p>
-    <w:p>
-      <w:pPr>
-        <w:spacing w:after="80"/>
-      </w:pPr>
-      <w:r>
-        <w:rPr>
-          <w:rFonts w:ascii="Calibri" w:cs="Calibri" w:eastAsia="Calibri" w:hAnsi="Calibri"/>
-          <w:i/>
-          <w:iCs/>
-          <w:color w:val="666666"/>
-          <w:sz w:val="19"/>
-          <w:szCs w:val="19"/>
-        </w:rPr>
-        <w:t xml:space="preserve">Maximum 150 words: the problem, the users, the core value. Link to the architecture diagram in the SDD.</w:t>
       </w:r>
     </w:p>
     <w:p>
@@ -1570,6 +1669,7 @@
     <w:p>
       <w:pPr>
         <w:pStyle w:val="Heading2"/>
+        <w:keepNext/>
         <w:spacing w:after="100" w:before="240"/>
       </w:pPr>
       <w:r>
@@ -1582,22 +1682,6 @@
           <w:szCs w:val="24"/>
         </w:rPr>
         <w:t xml:space="preserve">3. Key Design Decisions</w:t>
-      </w:r>
-    </w:p>
-    <w:p>
-      <w:pPr>
-        <w:spacing w:after="80"/>
-      </w:pPr>
-      <w:r>
-        <w:rPr>
-          <w:rFonts w:ascii="Calibri" w:cs="Calibri" w:eastAsia="Calibri" w:hAnsi="Calibri"/>
-          <w:i/>
-          <w:iCs/>
-          <w:color w:val="666666"/>
-          <w:sz w:val="19"/>
-          <w:szCs w:val="19"/>
-        </w:rPr>
-        <w:t xml:space="preserve">Exactly 5 decisions. Each must have one owner.</w:t>
       </w:r>
     </w:p>
     <w:tbl>
@@ -1980,7 +2064,7 @@
                 <w:sz w:val="16"/>
                 <w:szCs w:val="19"/>
               </w:rPr>
-              <w:t>[Owner]</w:t>
+              <w:t>Thuận</w:t>
             </w:r>
           </w:p>
         </w:tc>
@@ -2174,7 +2258,7 @@
                 <w:sz w:val="16"/>
                 <w:szCs w:val="19"/>
               </w:rPr>
-              <w:t>[Owner]</w:t>
+              <w:t>Thi</w:t>
             </w:r>
           </w:p>
         </w:tc>
@@ -2368,7 +2452,7 @@
                 <w:sz w:val="16"/>
                 <w:szCs w:val="19"/>
               </w:rPr>
-              <w:t>[Owner]</w:t>
+              <w:t>Thuận</w:t>
             </w:r>
           </w:p>
         </w:tc>
@@ -2562,7 +2646,7 @@
                 <w:sz w:val="16"/>
                 <w:szCs w:val="19"/>
               </w:rPr>
-              <w:t>[Owner]</w:t>
+              <w:t>Thuận</w:t>
             </w:r>
           </w:p>
         </w:tc>
@@ -2756,7 +2840,7 @@
                 <w:sz w:val="16"/>
                 <w:szCs w:val="19"/>
               </w:rPr>
-              <w:t>[Owner]</w:t>
+              <w:t>Thuận</w:t>
             </w:r>
           </w:p>
         </w:tc>
@@ -2797,6 +2881,7 @@
     <w:p>
       <w:pPr>
         <w:pStyle w:val="Heading2"/>
+        <w:keepNext/>
         <w:spacing w:after="100" w:before="240"/>
       </w:pPr>
       <w:r>
@@ -3157,7 +3242,7 @@
                 <w:sz w:val="16"/>
                 <w:szCs w:val="19"/>
               </w:rPr>
-              <w:t>[Owner]</w:t>
+              <w:t>Thuận</w:t>
             </w:r>
           </w:p>
         </w:tc>
@@ -3319,7 +3404,7 @@
                 <w:sz w:val="16"/>
                 <w:szCs w:val="19"/>
               </w:rPr>
-              <w:t>[Owner]</w:t>
+              <w:t>Thuận</w:t>
             </w:r>
           </w:p>
         </w:tc>
@@ -3481,7 +3566,7 @@
                 <w:sz w:val="16"/>
                 <w:szCs w:val="19"/>
               </w:rPr>
-              <w:t>[Owner]</w:t>
+              <w:t>Thi</w:t>
             </w:r>
           </w:p>
         </w:tc>
@@ -3490,6 +3575,7 @@
     <w:p>
       <w:pPr>
         <w:pStyle w:val="Heading2"/>
+        <w:keepNext/>
         <w:spacing w:after="100" w:before="240"/>
       </w:pPr>
       <w:r>
@@ -3502,22 +3588,6 @@
           <w:szCs w:val="24"/>
         </w:rPr>
         <w:t xml:space="preserve">5. Known Gaps</w:t>
-      </w:r>
-    </w:p>
-    <w:p>
-      <w:pPr>
-        <w:spacing w:after="80"/>
-      </w:pPr>
-      <w:r>
-        <w:rPr>
-          <w:rFonts w:ascii="Calibri" w:cs="Calibri" w:eastAsia="Calibri" w:hAnsi="Calibri"/>
-          <w:i/>
-          <w:iCs/>
-          <w:color w:val="666666"/>
-          <w:sz w:val="19"/>
-          <w:szCs w:val="19"/>
-        </w:rPr>
-        <w:t xml:space="preserve">Mismatches between the registration form, SRS, SDD and code. Include every High finding marked Kept or Planned in Form BM02.</w:t>
       </w:r>
     </w:p>
     <w:tbl>
@@ -3833,7 +3903,7 @@
                 <w:sz w:val="19"/>
                 <w:szCs w:val="19"/>
               </w:rPr>
-              <w:t xml:space="preserve">Registration 3.2; Report 1 FE-06; SDD 1.1</w:t>
+              <w:t xml:space="preserve">Registration 3.2; Report 1 FE-06; SDD 1.1; BM02 F01</w:t>
             </w:r>
           </w:p>
         </w:tc>
@@ -3895,7 +3965,7 @@
                 <w:sz w:val="19"/>
                 <w:szCs w:val="19"/>
               </w:rPr>
-              <w:t xml:space="preserve">[Owner]</w:t>
+              <w:t xml:space="preserve">Việt</w:t>
             </w:r>
           </w:p>
         </w:tc>
@@ -4083,7 +4153,7 @@
                 <w:sz w:val="19"/>
                 <w:szCs w:val="19"/>
               </w:rPr>
-              <w:t xml:space="preserve">[Owner]</w:t>
+              <w:t xml:space="preserve">Thuận</w:t>
             </w:r>
           </w:p>
         </w:tc>
@@ -4271,7 +4341,7 @@
                 <w:sz w:val="19"/>
                 <w:szCs w:val="19"/>
               </w:rPr>
-              <w:t xml:space="preserve">[Owner]</w:t>
+              <w:t xml:space="preserve">Thuận</w:t>
             </w:r>
           </w:p>
         </w:tc>
@@ -4459,7 +4529,7 @@
                 <w:sz w:val="19"/>
                 <w:szCs w:val="19"/>
               </w:rPr>
-              <w:t xml:space="preserve">[Owner]</w:t>
+              <w:t xml:space="preserve">Thi</w:t>
             </w:r>
           </w:p>
         </w:tc>
@@ -4647,7 +4717,7 @@
                 <w:sz w:val="19"/>
                 <w:szCs w:val="19"/>
               </w:rPr>
-              <w:t xml:space="preserve">[Owner]</w:t>
+              <w:t xml:space="preserve">Thi</w:t>
             </w:r>
           </w:p>
         </w:tc>
@@ -4679,6 +4749,758 @@
                 <w:szCs w:val="19"/>
               </w:rPr>
               <w:t xml:space="preserve">20/11/2026</w:t>
+            </w:r>
+          </w:p>
+        </w:tc>
+      </w:tr>
+      <w:tr>
+        <w:tc>
+          <w:tcPr>
+            <w:tcW w:type="dxa" w:w="642"/>
+            <w:tcBorders>
+              <w:top w:val="single" w:color="D9D4CA" w:sz="4"/>
+              <w:left w:val="single" w:color="D9D4CA" w:sz="4"/>
+              <w:bottom w:val="single" w:color="D9D4CA" w:sz="4"/>
+              <w:right w:val="single" w:color="D9D4CA" w:sz="4"/>
+            </w:tcBorders>
+            <w:tcMar>
+              <w:top w:type="dxa" w:w="60"/>
+              <w:left w:type="dxa" w:w="80"/>
+              <w:bottom w:type="dxa" w:w="60"/>
+              <w:right w:type="dxa" w:w="80"/>
+            </w:tcMar>
+          </w:tcPr>
+          <w:p>
+            <w:r>
+              <w:rPr>
+                <w:rFonts w:ascii="Calibri" w:cs="Calibri" w:eastAsia="Calibri" w:hAnsi="Calibri"/>
+                <w:b w:val="false"/>
+                <w:bCs w:val="false"/>
+                <w:i w:val="false"/>
+                <w:iCs w:val="false"/>
+                <w:sz w:val="19"/>
+                <w:szCs w:val="19"/>
+              </w:rPr>
+              <w:t xml:space="preserve">G6</w:t>
+            </w:r>
+          </w:p>
+        </w:tc>
+        <w:tc>
+          <w:tcPr>
+            <w:tcW w:type="dxa" w:w="2570"/>
+            <w:tcBorders>
+              <w:top w:val="single" w:color="D9D4CA" w:sz="4"/>
+              <w:left w:val="single" w:color="D9D4CA" w:sz="4"/>
+              <w:bottom w:val="single" w:color="D9D4CA" w:sz="4"/>
+              <w:right w:val="single" w:color="D9D4CA" w:sz="4"/>
+            </w:tcBorders>
+            <w:tcMar>
+              <w:top w:type="dxa" w:w="60"/>
+              <w:left w:type="dxa" w:w="80"/>
+              <w:bottom w:type="dxa" w:w="60"/>
+              <w:right w:type="dxa" w:w="80"/>
+            </w:tcMar>
+          </w:tcPr>
+          <w:p>
+            <w:r>
+              <w:rPr>
+                <w:rFonts w:ascii="Calibri" w:cs="Calibri" w:eastAsia="Calibri" w:hAnsi="Calibri"/>
+                <w:b w:val="false"/>
+                <w:bCs w:val="false"/>
+                <w:i w:val="false"/>
+                <w:iCs w:val="false"/>
+                <w:sz w:val="19"/>
+                <w:szCs w:val="19"/>
+              </w:rPr>
+              <w:t xml:space="preserve">Registration: merge orders across platforms; the system groups orders only within one shop (BM02 F02, Kept)</w:t>
+            </w:r>
+          </w:p>
+        </w:tc>
+        <w:tc>
+          <w:tcPr>
+            <w:tcW w:type="dxa" w:w="1927"/>
+            <w:tcBorders>
+              <w:top w:val="single" w:color="D9D4CA" w:sz="4"/>
+              <w:left w:val="single" w:color="D9D4CA" w:sz="4"/>
+              <w:bottom w:val="single" w:color="D9D4CA" w:sz="4"/>
+              <w:right w:val="single" w:color="D9D4CA" w:sz="4"/>
+            </w:tcBorders>
+            <w:tcMar>
+              <w:top w:type="dxa" w:w="60"/>
+              <w:left w:type="dxa" w:w="80"/>
+              <w:bottom w:type="dxa" w:w="60"/>
+              <w:right w:type="dxa" w:w="80"/>
+            </w:tcMar>
+          </w:tcPr>
+          <w:p>
+            <w:r>
+              <w:rPr>
+                <w:rFonts w:ascii="Calibri" w:cs="Calibri" w:eastAsia="Calibri" w:hAnsi="Calibri"/>
+                <w:b w:val="false"/>
+                <w:bCs w:val="false"/>
+                <w:i w:val="false"/>
+                <w:iCs w:val="false"/>
+                <w:sz w:val="19"/>
+                <w:szCs w:val="19"/>
+              </w:rPr>
+              <w:t xml:space="preserve">Registration 3.1; SRS BR-01</w:t>
+            </w:r>
+          </w:p>
+        </w:tc>
+        <w:tc>
+          <w:tcPr>
+            <w:tcW w:type="dxa" w:w="1927"/>
+            <w:tcBorders>
+              <w:top w:val="single" w:color="D9D4CA" w:sz="4"/>
+              <w:left w:val="single" w:color="D9D4CA" w:sz="4"/>
+              <w:bottom w:val="single" w:color="D9D4CA" w:sz="4"/>
+              <w:right w:val="single" w:color="D9D4CA" w:sz="4"/>
+            </w:tcBorders>
+            <w:tcMar>
+              <w:top w:type="dxa" w:w="60"/>
+              <w:left w:type="dxa" w:w="80"/>
+              <w:bottom w:type="dxa" w:w="60"/>
+              <w:right w:type="dxa" w:w="80"/>
+            </w:tcMar>
+          </w:tcPr>
+          <w:p>
+            <w:r>
+              <w:rPr>
+                <w:rFonts w:ascii="Calibri" w:cs="Calibri" w:eastAsia="Calibri" w:hAnsi="Calibri"/>
+                <w:b w:val="false"/>
+                <w:bCs w:val="false"/>
+                <w:i w:val="false"/>
+                <w:iCs w:val="false"/>
+                <w:sz w:val="19"/>
+                <w:szCs w:val="19"/>
+              </w:rPr>
+              <w:t xml:space="preserve">Kept: each platform has its own carrier order; same-recipient groups can be linked (UC-16); confirm wording with reviewers</w:t>
+            </w:r>
+          </w:p>
+        </w:tc>
+        <w:tc>
+          <w:tcPr>
+            <w:tcW w:type="dxa" w:w="1285"/>
+            <w:tcBorders>
+              <w:top w:val="single" w:color="D9D4CA" w:sz="4"/>
+              <w:left w:val="single" w:color="D9D4CA" w:sz="4"/>
+              <w:bottom w:val="single" w:color="D9D4CA" w:sz="4"/>
+              <w:right w:val="single" w:color="D9D4CA" w:sz="4"/>
+            </w:tcBorders>
+            <w:tcMar>
+              <w:top w:type="dxa" w:w="60"/>
+              <w:left w:type="dxa" w:w="80"/>
+              <w:bottom w:type="dxa" w:w="60"/>
+              <w:right w:type="dxa" w:w="80"/>
+            </w:tcMar>
+          </w:tcPr>
+          <w:p>
+            <w:r>
+              <w:rPr>
+                <w:rFonts w:ascii="Calibri" w:cs="Calibri" w:eastAsia="Calibri" w:hAnsi="Calibri"/>
+                <w:b w:val="false"/>
+                <w:bCs w:val="false"/>
+                <w:i w:val="false"/>
+                <w:iCs w:val="false"/>
+                <w:sz w:val="19"/>
+                <w:szCs w:val="19"/>
+              </w:rPr>
+              <w:t xml:space="preserve">Thuận</w:t>
+            </w:r>
+          </w:p>
+        </w:tc>
+        <w:tc>
+          <w:tcPr>
+            <w:tcW w:type="dxa" w:w="1287"/>
+            <w:tcBorders>
+              <w:top w:val="single" w:color="D9D4CA" w:sz="4"/>
+              <w:left w:val="single" w:color="D9D4CA" w:sz="4"/>
+              <w:bottom w:val="single" w:color="D9D4CA" w:sz="4"/>
+              <w:right w:val="single" w:color="D9D4CA" w:sz="4"/>
+            </w:tcBorders>
+            <w:tcMar>
+              <w:top w:type="dxa" w:w="60"/>
+              <w:left w:type="dxa" w:w="80"/>
+              <w:bottom w:type="dxa" w:w="60"/>
+              <w:right w:type="dxa" w:w="80"/>
+            </w:tcMar>
+          </w:tcPr>
+          <w:p>
+            <w:r>
+              <w:rPr>
+                <w:rFonts w:ascii="Calibri" w:cs="Calibri" w:eastAsia="Calibri" w:hAnsi="Calibri"/>
+                <w:b w:val="false"/>
+                <w:bCs w:val="false"/>
+                <w:i w:val="false"/>
+                <w:iCs w:val="false"/>
+                <w:sz w:val="19"/>
+                <w:szCs w:val="19"/>
+              </w:rPr>
+              <w:t xml:space="preserve">Review 2 session</w:t>
+            </w:r>
+          </w:p>
+        </w:tc>
+      </w:tr>
+      <w:tr>
+        <w:tc>
+          <w:tcPr>
+            <w:tcW w:type="dxa" w:w="642"/>
+            <w:tcBorders>
+              <w:top w:val="single" w:color="D9D4CA" w:sz="4"/>
+              <w:left w:val="single" w:color="D9D4CA" w:sz="4"/>
+              <w:bottom w:val="single" w:color="D9D4CA" w:sz="4"/>
+              <w:right w:val="single" w:color="D9D4CA" w:sz="4"/>
+            </w:tcBorders>
+            <w:tcMar>
+              <w:top w:type="dxa" w:w="60"/>
+              <w:left w:type="dxa" w:w="80"/>
+              <w:bottom w:type="dxa" w:w="60"/>
+              <w:right w:type="dxa" w:w="80"/>
+            </w:tcMar>
+          </w:tcPr>
+          <w:p>
+            <w:r>
+              <w:rPr>
+                <w:rFonts w:ascii="Calibri" w:cs="Calibri" w:eastAsia="Calibri" w:hAnsi="Calibri"/>
+                <w:b w:val="false"/>
+                <w:bCs w:val="false"/>
+                <w:i w:val="false"/>
+                <w:iCs w:val="false"/>
+                <w:sz w:val="19"/>
+                <w:szCs w:val="19"/>
+              </w:rPr>
+              <w:t xml:space="preserve">G7</w:t>
+            </w:r>
+          </w:p>
+        </w:tc>
+        <w:tc>
+          <w:tcPr>
+            <w:tcW w:type="dxa" w:w="2570"/>
+            <w:tcBorders>
+              <w:top w:val="single" w:color="D9D4CA" w:sz="4"/>
+              <w:left w:val="single" w:color="D9D4CA" w:sz="4"/>
+              <w:bottom w:val="single" w:color="D9D4CA" w:sz="4"/>
+              <w:right w:val="single" w:color="D9D4CA" w:sz="4"/>
+            </w:tcBorders>
+            <w:tcMar>
+              <w:top w:type="dxa" w:w="60"/>
+              <w:left w:type="dxa" w:w="80"/>
+              <w:bottom w:type="dxa" w:w="60"/>
+              <w:right w:type="dxa" w:w="80"/>
+            </w:tcMar>
+          </w:tcPr>
+          <w:p>
+            <w:r>
+              <w:rPr>
+                <w:rFonts w:ascii="Calibri" w:cs="Calibri" w:eastAsia="Calibri" w:hAnsi="Calibri"/>
+                <w:b w:val="false"/>
+                <w:bCs w:val="false"/>
+                <w:i w:val="false"/>
+                <w:iCs w:val="false"/>
+                <w:sz w:val="19"/>
+                <w:szCs w:val="19"/>
+              </w:rPr>
+              <w:t xml:space="preserve">No state machine for Packing Plan, Shipment, Return Request, Order (BM02 F03)</w:t>
+            </w:r>
+          </w:p>
+        </w:tc>
+        <w:tc>
+          <w:tcPr>
+            <w:tcW w:type="dxa" w:w="1927"/>
+            <w:tcBorders>
+              <w:top w:val="single" w:color="D9D4CA" w:sz="4"/>
+              <w:left w:val="single" w:color="D9D4CA" w:sz="4"/>
+              <w:bottom w:val="single" w:color="D9D4CA" w:sz="4"/>
+              <w:right w:val="single" w:color="D9D4CA" w:sz="4"/>
+            </w:tcBorders>
+            <w:tcMar>
+              <w:top w:type="dxa" w:w="60"/>
+              <w:left w:type="dxa" w:w="80"/>
+              <w:bottom w:type="dxa" w:w="60"/>
+              <w:right w:type="dxa" w:w="80"/>
+            </w:tcMar>
+          </w:tcPr>
+          <w:p>
+            <w:r>
+              <w:rPr>
+                <w:rFonts w:ascii="Calibri" w:cs="Calibri" w:eastAsia="Calibri" w:hAnsi="Calibri"/>
+                <w:b w:val="false"/>
+                <w:bCs w:val="false"/>
+                <w:i w:val="false"/>
+                <w:iCs w:val="false"/>
+                <w:sz w:val="19"/>
+                <w:szCs w:val="19"/>
+              </w:rPr>
+              <w:t xml:space="preserve">SDD 3.8</w:t>
+            </w:r>
+          </w:p>
+        </w:tc>
+        <w:tc>
+          <w:tcPr>
+            <w:tcW w:type="dxa" w:w="1927"/>
+            <w:tcBorders>
+              <w:top w:val="single" w:color="D9D4CA" w:sz="4"/>
+              <w:left w:val="single" w:color="D9D4CA" w:sz="4"/>
+              <w:bottom w:val="single" w:color="D9D4CA" w:sz="4"/>
+              <w:right w:val="single" w:color="D9D4CA" w:sz="4"/>
+            </w:tcBorders>
+            <w:tcMar>
+              <w:top w:type="dxa" w:w="60"/>
+              <w:left w:type="dxa" w:w="80"/>
+              <w:bottom w:type="dxa" w:w="60"/>
+              <w:right w:type="dxa" w:w="80"/>
+            </w:tcMar>
+          </w:tcPr>
+          <w:p>
+            <w:r>
+              <w:rPr>
+                <w:rFonts w:ascii="Calibri" w:cs="Calibri" w:eastAsia="Calibri" w:hAnsi="Calibri"/>
+                <w:b w:val="false"/>
+                <w:bCs w:val="false"/>
+                <w:i w:val="false"/>
+                <w:iCs w:val="false"/>
+                <w:sz w:val="19"/>
+                <w:szCs w:val="19"/>
+              </w:rPr>
+              <w:t xml:space="preserve">Draw them in PlantUML from the status enums</w:t>
+            </w:r>
+          </w:p>
+        </w:tc>
+        <w:tc>
+          <w:tcPr>
+            <w:tcW w:type="dxa" w:w="1285"/>
+            <w:tcBorders>
+              <w:top w:val="single" w:color="D9D4CA" w:sz="4"/>
+              <w:left w:val="single" w:color="D9D4CA" w:sz="4"/>
+              <w:bottom w:val="single" w:color="D9D4CA" w:sz="4"/>
+              <w:right w:val="single" w:color="D9D4CA" w:sz="4"/>
+            </w:tcBorders>
+            <w:tcMar>
+              <w:top w:type="dxa" w:w="60"/>
+              <w:left w:type="dxa" w:w="80"/>
+              <w:bottom w:type="dxa" w:w="60"/>
+              <w:right w:type="dxa" w:w="80"/>
+            </w:tcMar>
+          </w:tcPr>
+          <w:p>
+            <w:r>
+              <w:rPr>
+                <w:rFonts w:ascii="Calibri" w:cs="Calibri" w:eastAsia="Calibri" w:hAnsi="Calibri"/>
+                <w:b w:val="false"/>
+                <w:bCs w:val="false"/>
+                <w:i w:val="false"/>
+                <w:iCs w:val="false"/>
+                <w:sz w:val="19"/>
+                <w:szCs w:val="19"/>
+              </w:rPr>
+              <w:t xml:space="preserve">Thuận</w:t>
+            </w:r>
+          </w:p>
+        </w:tc>
+        <w:tc>
+          <w:tcPr>
+            <w:tcW w:type="dxa" w:w="1287"/>
+            <w:tcBorders>
+              <w:top w:val="single" w:color="D9D4CA" w:sz="4"/>
+              <w:left w:val="single" w:color="D9D4CA" w:sz="4"/>
+              <w:bottom w:val="single" w:color="D9D4CA" w:sz="4"/>
+              <w:right w:val="single" w:color="D9D4CA" w:sz="4"/>
+            </w:tcBorders>
+            <w:tcMar>
+              <w:top w:type="dxa" w:w="60"/>
+              <w:left w:type="dxa" w:w="80"/>
+              <w:bottom w:type="dxa" w:w="60"/>
+              <w:right w:type="dxa" w:w="80"/>
+            </w:tcMar>
+          </w:tcPr>
+          <w:p>
+            <w:r>
+              <w:rPr>
+                <w:rFonts w:ascii="Calibri" w:cs="Calibri" w:eastAsia="Calibri" w:hAnsi="Calibri"/>
+                <w:b w:val="false"/>
+                <w:bCs w:val="false"/>
+                <w:i w:val="false"/>
+                <w:iCs w:val="false"/>
+                <w:sz w:val="19"/>
+                <w:szCs w:val="19"/>
+              </w:rPr>
+              <w:t xml:space="preserve">08/11/2026</w:t>
+            </w:r>
+          </w:p>
+        </w:tc>
+      </w:tr>
+      <w:tr>
+        <w:tc>
+          <w:tcPr>
+            <w:tcW w:type="dxa" w:w="642"/>
+            <w:tcBorders>
+              <w:top w:val="single" w:color="D9D4CA" w:sz="4"/>
+              <w:left w:val="single" w:color="D9D4CA" w:sz="4"/>
+              <w:bottom w:val="single" w:color="D9D4CA" w:sz="4"/>
+              <w:right w:val="single" w:color="D9D4CA" w:sz="4"/>
+            </w:tcBorders>
+            <w:tcMar>
+              <w:top w:type="dxa" w:w="60"/>
+              <w:left w:type="dxa" w:w="80"/>
+              <w:bottom w:type="dxa" w:w="60"/>
+              <w:right w:type="dxa" w:w="80"/>
+            </w:tcMar>
+          </w:tcPr>
+          <w:p>
+            <w:r>
+              <w:rPr>
+                <w:rFonts w:ascii="Calibri" w:cs="Calibri" w:eastAsia="Calibri" w:hAnsi="Calibri"/>
+                <w:b w:val="false"/>
+                <w:bCs w:val="false"/>
+                <w:i w:val="false"/>
+                <w:iCs w:val="false"/>
+                <w:sz w:val="19"/>
+                <w:szCs w:val="19"/>
+              </w:rPr>
+              <w:t xml:space="preserve">G8</w:t>
+            </w:r>
+          </w:p>
+        </w:tc>
+        <w:tc>
+          <w:tcPr>
+            <w:tcW w:type="dxa" w:w="2570"/>
+            <w:tcBorders>
+              <w:top w:val="single" w:color="D9D4CA" w:sz="4"/>
+              <w:left w:val="single" w:color="D9D4CA" w:sz="4"/>
+              <w:bottom w:val="single" w:color="D9D4CA" w:sz="4"/>
+              <w:right w:val="single" w:color="D9D4CA" w:sz="4"/>
+            </w:tcBorders>
+            <w:tcMar>
+              <w:top w:type="dxa" w:w="60"/>
+              <w:left w:type="dxa" w:w="80"/>
+              <w:bottom w:type="dxa" w:w="60"/>
+              <w:right w:type="dxa" w:w="80"/>
+            </w:tcMar>
+          </w:tcPr>
+          <w:p>
+            <w:r>
+              <w:rPr>
+                <w:rFonts w:ascii="Calibri" w:cs="Calibri" w:eastAsia="Calibri" w:hAnsi="Calibri"/>
+                <w:b w:val="false"/>
+                <w:bCs w:val="false"/>
+                <w:i w:val="false"/>
+                <w:iCs w:val="false"/>
+                <w:sz w:val="19"/>
+                <w:szCs w:val="19"/>
+              </w:rPr>
+              <w:t xml:space="preserve">Architecture diagram shows a mobile app; misses AURELLE website, Open API simulator, Google OAuth, SMTP (BM02 F04)</w:t>
+            </w:r>
+          </w:p>
+        </w:tc>
+        <w:tc>
+          <w:tcPr>
+            <w:tcW w:type="dxa" w:w="1927"/>
+            <w:tcBorders>
+              <w:top w:val="single" w:color="D9D4CA" w:sz="4"/>
+              <w:left w:val="single" w:color="D9D4CA" w:sz="4"/>
+              <w:bottom w:val="single" w:color="D9D4CA" w:sz="4"/>
+              <w:right w:val="single" w:color="D9D4CA" w:sz="4"/>
+            </w:tcBorders>
+            <w:tcMar>
+              <w:top w:type="dxa" w:w="60"/>
+              <w:left w:type="dxa" w:w="80"/>
+              <w:bottom w:type="dxa" w:w="60"/>
+              <w:right w:type="dxa" w:w="80"/>
+            </w:tcMar>
+          </w:tcPr>
+          <w:p>
+            <w:r>
+              <w:rPr>
+                <w:rFonts w:ascii="Calibri" w:cs="Calibri" w:eastAsia="Calibri" w:hAnsi="Calibri"/>
+                <w:b w:val="false"/>
+                <w:bCs w:val="false"/>
+                <w:i w:val="false"/>
+                <w:iCs w:val="false"/>
+                <w:sz w:val="19"/>
+                <w:szCs w:val="19"/>
+              </w:rPr>
+              <w:t xml:space="preserve">SDD Figure 1</w:t>
+            </w:r>
+          </w:p>
+        </w:tc>
+        <w:tc>
+          <w:tcPr>
+            <w:tcW w:type="dxa" w:w="1927"/>
+            <w:tcBorders>
+              <w:top w:val="single" w:color="D9D4CA" w:sz="4"/>
+              <w:left w:val="single" w:color="D9D4CA" w:sz="4"/>
+              <w:bottom w:val="single" w:color="D9D4CA" w:sz="4"/>
+              <w:right w:val="single" w:color="D9D4CA" w:sz="4"/>
+            </w:tcBorders>
+            <w:tcMar>
+              <w:top w:type="dxa" w:w="60"/>
+              <w:left w:type="dxa" w:w="80"/>
+              <w:bottom w:type="dxa" w:w="60"/>
+              <w:right w:type="dxa" w:w="80"/>
+            </w:tcMar>
+          </w:tcPr>
+          <w:p>
+            <w:r>
+              <w:rPr>
+                <w:rFonts w:ascii="Calibri" w:cs="Calibri" w:eastAsia="Calibri" w:hAnsi="Calibri"/>
+                <w:b w:val="false"/>
+                <w:bCs w:val="false"/>
+                <w:i w:val="false"/>
+                <w:iCs w:val="false"/>
+                <w:sz w:val="19"/>
+                <w:szCs w:val="19"/>
+              </w:rPr>
+              <w:t xml:space="preserve">Update the .puml to match SDD 1.1 and re-export</w:t>
+            </w:r>
+          </w:p>
+        </w:tc>
+        <w:tc>
+          <w:tcPr>
+            <w:tcW w:type="dxa" w:w="1285"/>
+            <w:tcBorders>
+              <w:top w:val="single" w:color="D9D4CA" w:sz="4"/>
+              <w:left w:val="single" w:color="D9D4CA" w:sz="4"/>
+              <w:bottom w:val="single" w:color="D9D4CA" w:sz="4"/>
+              <w:right w:val="single" w:color="D9D4CA" w:sz="4"/>
+            </w:tcBorders>
+            <w:tcMar>
+              <w:top w:type="dxa" w:w="60"/>
+              <w:left w:type="dxa" w:w="80"/>
+              <w:bottom w:type="dxa" w:w="60"/>
+              <w:right w:type="dxa" w:w="80"/>
+            </w:tcMar>
+          </w:tcPr>
+          <w:p>
+            <w:r>
+              <w:rPr>
+                <w:rFonts w:ascii="Calibri" w:cs="Calibri" w:eastAsia="Calibri" w:hAnsi="Calibri"/>
+                <w:b w:val="false"/>
+                <w:bCs w:val="false"/>
+                <w:i w:val="false"/>
+                <w:iCs w:val="false"/>
+                <w:sz w:val="19"/>
+                <w:szCs w:val="19"/>
+              </w:rPr>
+              <w:t xml:space="preserve">Thuận</w:t>
+            </w:r>
+          </w:p>
+        </w:tc>
+        <w:tc>
+          <w:tcPr>
+            <w:tcW w:type="dxa" w:w="1287"/>
+            <w:tcBorders>
+              <w:top w:val="single" w:color="D9D4CA" w:sz="4"/>
+              <w:left w:val="single" w:color="D9D4CA" w:sz="4"/>
+              <w:bottom w:val="single" w:color="D9D4CA" w:sz="4"/>
+              <w:right w:val="single" w:color="D9D4CA" w:sz="4"/>
+            </w:tcBorders>
+            <w:tcMar>
+              <w:top w:type="dxa" w:w="60"/>
+              <w:left w:type="dxa" w:w="80"/>
+              <w:bottom w:type="dxa" w:w="60"/>
+              <w:right w:type="dxa" w:w="80"/>
+            </w:tcMar>
+          </w:tcPr>
+          <w:p>
+            <w:r>
+              <w:rPr>
+                <w:rFonts w:ascii="Calibri" w:cs="Calibri" w:eastAsia="Calibri" w:hAnsi="Calibri"/>
+                <w:b w:val="false"/>
+                <w:bCs w:val="false"/>
+                <w:i w:val="false"/>
+                <w:iCs w:val="false"/>
+                <w:sz w:val="19"/>
+                <w:szCs w:val="19"/>
+              </w:rPr>
+              <w:t xml:space="preserve">08/11/2026</w:t>
+            </w:r>
+          </w:p>
+        </w:tc>
+      </w:tr>
+      <w:tr>
+        <w:tc>
+          <w:tcPr>
+            <w:tcW w:type="dxa" w:w="642"/>
+            <w:tcBorders>
+              <w:top w:val="single" w:color="D9D4CA" w:sz="4"/>
+              <w:left w:val="single" w:color="D9D4CA" w:sz="4"/>
+              <w:bottom w:val="single" w:color="D9D4CA" w:sz="4"/>
+              <w:right w:val="single" w:color="D9D4CA" w:sz="4"/>
+            </w:tcBorders>
+            <w:tcMar>
+              <w:top w:type="dxa" w:w="60"/>
+              <w:left w:type="dxa" w:w="80"/>
+              <w:bottom w:type="dxa" w:w="60"/>
+              <w:right w:type="dxa" w:w="80"/>
+            </w:tcMar>
+          </w:tcPr>
+          <w:p>
+            <w:r>
+              <w:rPr>
+                <w:rFonts w:ascii="Calibri" w:cs="Calibri" w:eastAsia="Calibri" w:hAnsi="Calibri"/>
+                <w:b w:val="false"/>
+                <w:bCs w:val="false"/>
+                <w:i w:val="false"/>
+                <w:iCs w:val="false"/>
+                <w:sz w:val="19"/>
+                <w:szCs w:val="19"/>
+              </w:rPr>
+              <w:t xml:space="preserve">G9</w:t>
+            </w:r>
+          </w:p>
+        </w:tc>
+        <w:tc>
+          <w:tcPr>
+            <w:tcW w:type="dxa" w:w="2570"/>
+            <w:tcBorders>
+              <w:top w:val="single" w:color="D9D4CA" w:sz="4"/>
+              <w:left w:val="single" w:color="D9D4CA" w:sz="4"/>
+              <w:bottom w:val="single" w:color="D9D4CA" w:sz="4"/>
+              <w:right w:val="single" w:color="D9D4CA" w:sz="4"/>
+            </w:tcBorders>
+            <w:tcMar>
+              <w:top w:type="dxa" w:w="60"/>
+              <w:left w:type="dxa" w:w="80"/>
+              <w:bottom w:type="dxa" w:w="60"/>
+              <w:right w:type="dxa" w:w="80"/>
+            </w:tcMar>
+          </w:tcPr>
+          <w:p>
+            <w:r>
+              <w:rPr>
+                <w:rFonts w:ascii="Calibri" w:cs="Calibri" w:eastAsia="Calibri" w:hAnsi="Calibri"/>
+                <w:b w:val="false"/>
+                <w:bCs w:val="false"/>
+                <w:i w:val="false"/>
+                <w:iCs w:val="false"/>
+                <w:sz w:val="19"/>
+                <w:szCs w:val="19"/>
+              </w:rPr>
+              <w:t xml:space="preserve">Logical ERD misses main entities of the SRS entity table (BM02 F05)</w:t>
+            </w:r>
+          </w:p>
+        </w:tc>
+        <w:tc>
+          <w:tcPr>
+            <w:tcW w:type="dxa" w:w="1927"/>
+            <w:tcBorders>
+              <w:top w:val="single" w:color="D9D4CA" w:sz="4"/>
+              <w:left w:val="single" w:color="D9D4CA" w:sz="4"/>
+              <w:bottom w:val="single" w:color="D9D4CA" w:sz="4"/>
+              <w:right w:val="single" w:color="D9D4CA" w:sz="4"/>
+            </w:tcBorders>
+            <w:tcMar>
+              <w:top w:type="dxa" w:w="60"/>
+              <w:left w:type="dxa" w:w="80"/>
+              <w:bottom w:type="dxa" w:w="60"/>
+              <w:right w:type="dxa" w:w="80"/>
+            </w:tcMar>
+          </w:tcPr>
+          <w:p>
+            <w:r>
+              <w:rPr>
+                <w:rFonts w:ascii="Calibri" w:cs="Calibri" w:eastAsia="Calibri" w:hAnsi="Calibri"/>
+                <w:b w:val="false"/>
+                <w:bCs w:val="false"/>
+                <w:i w:val="false"/>
+                <w:iCs w:val="false"/>
+                <w:sz w:val="19"/>
+                <w:szCs w:val="19"/>
+              </w:rPr>
+              <w:t xml:space="preserve">SDD Figure 3</w:t>
+            </w:r>
+          </w:p>
+        </w:tc>
+        <w:tc>
+          <w:tcPr>
+            <w:tcW w:type="dxa" w:w="1927"/>
+            <w:tcBorders>
+              <w:top w:val="single" w:color="D9D4CA" w:sz="4"/>
+              <w:left w:val="single" w:color="D9D4CA" w:sz="4"/>
+              <w:bottom w:val="single" w:color="D9D4CA" w:sz="4"/>
+              <w:right w:val="single" w:color="D9D4CA" w:sz="4"/>
+            </w:tcBorders>
+            <w:tcMar>
+              <w:top w:type="dxa" w:w="60"/>
+              <w:left w:type="dxa" w:w="80"/>
+              <w:bottom w:type="dxa" w:w="60"/>
+              <w:right w:type="dxa" w:w="80"/>
+            </w:tcMar>
+          </w:tcPr>
+          <w:p>
+            <w:r>
+              <w:rPr>
+                <w:rFonts w:ascii="Calibri" w:cs="Calibri" w:eastAsia="Calibri" w:hAnsi="Calibri"/>
+                <w:b w:val="false"/>
+                <w:bCs w:val="false"/>
+                <w:i w:val="false"/>
+                <w:iCs w:val="false"/>
+                <w:sz w:val="19"/>
+                <w:szCs w:val="19"/>
+              </w:rPr>
+              <w:t xml:space="preserve">Add all main collections to erd.puml; add a database script</w:t>
+            </w:r>
+          </w:p>
+        </w:tc>
+        <w:tc>
+          <w:tcPr>
+            <w:tcW w:type="dxa" w:w="1285"/>
+            <w:tcBorders>
+              <w:top w:val="single" w:color="D9D4CA" w:sz="4"/>
+              <w:left w:val="single" w:color="D9D4CA" w:sz="4"/>
+              <w:bottom w:val="single" w:color="D9D4CA" w:sz="4"/>
+              <w:right w:val="single" w:color="D9D4CA" w:sz="4"/>
+            </w:tcBorders>
+            <w:tcMar>
+              <w:top w:type="dxa" w:w="60"/>
+              <w:left w:type="dxa" w:w="80"/>
+              <w:bottom w:type="dxa" w:w="60"/>
+              <w:right w:type="dxa" w:w="80"/>
+            </w:tcMar>
+          </w:tcPr>
+          <w:p>
+            <w:r>
+              <w:rPr>
+                <w:rFonts w:ascii="Calibri" w:cs="Calibri" w:eastAsia="Calibri" w:hAnsi="Calibri"/>
+                <w:b w:val="false"/>
+                <w:bCs w:val="false"/>
+                <w:i w:val="false"/>
+                <w:iCs w:val="false"/>
+                <w:sz w:val="19"/>
+                <w:szCs w:val="19"/>
+              </w:rPr>
+              <w:t xml:space="preserve">Thi</w:t>
+            </w:r>
+          </w:p>
+        </w:tc>
+        <w:tc>
+          <w:tcPr>
+            <w:tcW w:type="dxa" w:w="1287"/>
+            <w:tcBorders>
+              <w:top w:val="single" w:color="D9D4CA" w:sz="4"/>
+              <w:left w:val="single" w:color="D9D4CA" w:sz="4"/>
+              <w:bottom w:val="single" w:color="D9D4CA" w:sz="4"/>
+              <w:right w:val="single" w:color="D9D4CA" w:sz="4"/>
+            </w:tcBorders>
+            <w:tcMar>
+              <w:top w:type="dxa" w:w="60"/>
+              <w:left w:type="dxa" w:w="80"/>
+              <w:bottom w:type="dxa" w:w="60"/>
+              <w:right w:type="dxa" w:w="80"/>
+            </w:tcMar>
+          </w:tcPr>
+          <w:p>
+            <w:r>
+              <w:rPr>
+                <w:rFonts w:ascii="Calibri" w:cs="Calibri" w:eastAsia="Calibri" w:hAnsi="Calibri"/>
+                <w:b w:val="false"/>
+                <w:bCs w:val="false"/>
+                <w:i w:val="false"/>
+                <w:iCs w:val="false"/>
+                <w:sz w:val="19"/>
+                <w:szCs w:val="19"/>
+              </w:rPr>
+              <w:t xml:space="preserve">15/11/2026</w:t>
             </w:r>
           </w:p>
         </w:tc>
@@ -4687,6 +5509,7 @@
     <w:p>
       <w:pPr>
         <w:pStyle w:val="Heading2"/>
+        <w:keepNext/>
         <w:spacing w:after="100" w:before="240"/>
       </w:pPr>
       <w:r>
@@ -4699,22 +5522,6 @@
           <w:szCs w:val="24"/>
         </w:rPr>
         <w:t xml:space="preserve">6. Proposed Mandatory Features</w:t>
-      </w:r>
-    </w:p>
-    <w:p>
-      <w:pPr>
-        <w:spacing w:after="80"/>
-      </w:pPr>
-      <w:r>
-        <w:rPr>
-          <w:rFonts w:ascii="Calibri" w:cs="Calibri" w:eastAsia="Calibri" w:hAnsi="Calibri"/>
-          <w:i/>
-          <w:iCs/>
-          <w:color w:val="666666"/>
-          <w:sz w:val="19"/>
-          <w:szCs w:val="19"/>
-        </w:rPr>
-        <w:t xml:space="preserve">Within the scope in section 1. Acceptance criteria must be testable with a clear pass/fail result.</w:t>
       </w:r>
     </w:p>
     <w:tbl>
@@ -5097,7 +5904,7 @@
                 <w:sz w:val="16"/>
                 <w:szCs w:val="19"/>
               </w:rPr>
-              <w:t>[TC ids]</w:t>
+              <w:t>TC-F01-01 … TC-F01-03 (Report 5)</w:t>
             </w:r>
           </w:p>
         </w:tc>
@@ -5291,7 +6098,7 @@
                 <w:sz w:val="16"/>
                 <w:szCs w:val="19"/>
               </w:rPr>
-              <w:t>[TC ids]</w:t>
+              <w:t>TC-F02-01 … TC-F02-03 (Report 5)</w:t>
             </w:r>
           </w:p>
         </w:tc>
@@ -5485,7 +6292,7 @@
                 <w:sz w:val="16"/>
                 <w:szCs w:val="19"/>
               </w:rPr>
-              <w:t>[TC ids]</w:t>
+              <w:t>TC-F03-01 … TC-F03-03 (Report 5)</w:t>
             </w:r>
           </w:p>
         </w:tc>
@@ -5679,7 +6486,7 @@
                 <w:sz w:val="16"/>
                 <w:szCs w:val="19"/>
               </w:rPr>
-              <w:t>[TC ids]</w:t>
+              <w:t>TC-F04-01 … TC-F04-03 (Report 5)</w:t>
             </w:r>
           </w:p>
         </w:tc>
@@ -5873,7 +6680,7 @@
                 <w:sz w:val="16"/>
                 <w:szCs w:val="19"/>
               </w:rPr>
-              <w:t>[TC ids]</w:t>
+              <w:t>TC-F05-01 … TC-F05-03 (Report 5)</w:t>
             </w:r>
           </w:p>
         </w:tc>
@@ -6067,7 +6874,7 @@
                 <w:sz w:val="16"/>
                 <w:szCs w:val="19"/>
               </w:rPr>
-              <w:t>[TC ids]</w:t>
+              <w:t>TC-F06-01 … TC-F06-03 (Report 5)</w:t>
             </w:r>
           </w:p>
         </w:tc>
@@ -6261,7 +7068,7 @@
                 <w:sz w:val="16"/>
                 <w:szCs w:val="19"/>
               </w:rPr>
-              <w:t>[TC ids]</w:t>
+              <w:t>TC-F07-01 … TC-F07-03 (Report 5)</w:t>
             </w:r>
           </w:p>
         </w:tc>
@@ -6455,7 +7262,7 @@
                 <w:sz w:val="16"/>
                 <w:szCs w:val="19"/>
               </w:rPr>
-              <w:t>[TC ids]</w:t>
+              <w:t>TC-F08-01 … TC-F08-03 (Report 5)</w:t>
             </w:r>
           </w:p>
         </w:tc>
@@ -6649,7 +7456,7 @@
                 <w:sz w:val="16"/>
                 <w:szCs w:val="19"/>
               </w:rPr>
-              <w:t>[TC ids]</w:t>
+              <w:t>TC-F09-01 … TC-F09-03 (Report 5)</w:t>
             </w:r>
           </w:p>
         </w:tc>
@@ -6843,7 +7650,7 @@
                 <w:sz w:val="16"/>
                 <w:szCs w:val="19"/>
               </w:rPr>
-              <w:t>[TC ids]</w:t>
+              <w:t>TC-F10-01 … TC-F10-03 (Report 5)</w:t>
             </w:r>
           </w:p>
         </w:tc>
@@ -6884,6 +7691,7 @@
     <w:p>
       <w:pPr>
         <w:pStyle w:val="Heading2"/>
+        <w:keepNext/>
         <w:spacing w:after="100" w:before="240"/>
       </w:pPr>
       <w:r>
@@ -6896,22 +7704,6 @@
           <w:szCs w:val="24"/>
         </w:rPr>
         <w:t xml:space="preserve">7. Non-Functional Requirements</w:t>
-      </w:r>
-    </w:p>
-    <w:p>
-      <w:pPr>
-        <w:spacing w:after="80"/>
-      </w:pPr>
-      <w:r>
-        <w:rPr>
-          <w:rFonts w:ascii="Calibri" w:cs="Calibri" w:eastAsia="Calibri" w:hAnsi="Calibri"/>
-          <w:i/>
-          <w:iCs/>
-          <w:color w:val="666666"/>
-          <w:sz w:val="19"/>
-          <w:szCs w:val="19"/>
-        </w:rPr>
-        <w:t xml:space="preserve">Maximum 6 rows. Each NFR needs a metric, a threshold and a measurement method.</w:t>
       </w:r>
     </w:p>
     <w:tbl>
@@ -8079,6 +8871,7 @@
     <w:p>
       <w:pPr>
         <w:pStyle w:val="Heading2"/>
+        <w:keepNext/>
         <w:spacing w:after="100" w:before="240"/>
       </w:pPr>
       <w:r>
@@ -8091,22 +8884,6 @@
           <w:szCs w:val="24"/>
         </w:rPr>
         <w:t xml:space="preserve">8. Ownership Map</w:t>
-      </w:r>
-    </w:p>
-    <w:p>
-      <w:pPr>
-        <w:spacing w:after="80"/>
-      </w:pPr>
-      <w:r>
-        <w:rPr>
-          <w:rFonts w:ascii="Calibri" w:cs="Calibri" w:eastAsia="Calibri" w:hAnsi="Calibri"/>
-          <w:i/>
-          <w:iCs/>
-          <w:color w:val="666666"/>
-          <w:sz w:val="19"/>
-          <w:szCs w:val="19"/>
-        </w:rPr>
-        <w:t xml:space="preserve">One row per member. Each member owns 2–3 parts and at least one main workflow (Appendix A1).</w:t>
       </w:r>
     </w:p>
     <w:tbl>
@@ -8391,7 +9168,7 @@
                 <w:sz w:val="16"/>
                 <w:szCs w:val="19"/>
               </w:rPr>
-              <w:t>[Owned parts]</w:t>
+              <w:t>Marketplace integration and order intake; GHN shipping and AURELLE write-back; architecture, CI/CD, Review 2 documents</w:t>
             </w:r>
           </w:p>
         </w:tc>
@@ -8423,7 +9200,7 @@
                 <w:sz w:val="16"/>
                 <w:szCs w:val="19"/>
               </w:rPr>
-              <w:t>[WF]</w:t>
+              <w:t>WF-01, WF-04</w:t>
             </w:r>
           </w:p>
         </w:tc>
@@ -8455,7 +9232,7 @@
                 <w:sz w:val="16"/>
                 <w:szCs w:val="19"/>
               </w:rPr>
-              <w:t>[Decisions / PRs]</w:t>
+              <w:t>D1, D3–D5; PR #3–#4, #11–#18, #20–#21</w:t>
             </w:r>
           </w:p>
         </w:tc>
@@ -8553,7 +9330,7 @@
                 <w:sz w:val="16"/>
                 <w:szCs w:val="19"/>
               </w:rPr>
-              <w:t>[Owned parts]</w:t>
+              <w:t>Returns and exchanges; stock receiving by lot (FIFO); 3D packing solver</w:t>
             </w:r>
           </w:p>
         </w:tc>
@@ -8585,7 +9362,7 @@
                 <w:sz w:val="16"/>
                 <w:szCs w:val="19"/>
               </w:rPr>
-              <w:t>[WF]</w:t>
+              <w:t>WF-05, WF-06</w:t>
             </w:r>
           </w:p>
         </w:tc>
@@ -8617,7 +9394,7 @@
                 <w:sz w:val="16"/>
                 <w:szCs w:val="19"/>
               </w:rPr>
-              <w:t>[Decisions / PRs]</w:t>
+              <w:t>D2; PR #7</w:t>
             </w:r>
           </w:p>
         </w:tc>
@@ -8715,7 +9492,7 @@
                 <w:sz w:val="16"/>
                 <w:szCs w:val="19"/>
               </w:rPr>
-              <w:t>[Owned parts]</w:t>
+              <w:t>Packing Station UI (3D viewer, plan review, packing session); picking, shipping and returns screens</w:t>
             </w:r>
           </w:p>
         </w:tc>
@@ -8747,7 +9524,7 @@
                 <w:sz w:val="16"/>
                 <w:szCs w:val="19"/>
               </w:rPr>
-              <w:t>[WF]</w:t>
+              <w:t>WF-03</w:t>
             </w:r>
           </w:p>
         </w:tc>
@@ -8779,7 +9556,7 @@
                 <w:sz w:val="16"/>
                 <w:szCs w:val="19"/>
               </w:rPr>
-              <w:t>[Decisions / PRs]</w:t>
+              <w:t>PR #2, #8, #9, #10, #22</w:t>
             </w:r>
           </w:p>
         </w:tc>
@@ -8877,7 +9654,7 @@
                 <w:sz w:val="16"/>
                 <w:szCs w:val="19"/>
               </w:rPr>
-              <w:t>[Owned parts]</w:t>
+              <w:t>Admin portal (accounts, roles, leave); admin warehouse and SKU screens; marketplace connection screens</w:t>
             </w:r>
           </w:p>
         </w:tc>
@@ -8909,7 +9686,7 @@
                 <w:sz w:val="16"/>
                 <w:szCs w:val="19"/>
               </w:rPr>
-              <w:t>[WF]</w:t>
+              <w:t>WF-02</w:t>
             </w:r>
           </w:p>
         </w:tc>
@@ -8941,7 +9718,7 @@
                 <w:sz w:val="16"/>
                 <w:szCs w:val="19"/>
               </w:rPr>
-              <w:t>[Decisions / PRs]</w:t>
+              <w:t>Commits on feature/phuong_admin</w:t>
             </w:r>
           </w:p>
         </w:tc>
@@ -8955,6 +9732,7 @@
     <w:p>
       <w:pPr>
         <w:pStyle w:val="Heading1"/>
+        <w:keepNext/>
         <w:spacing w:after="160" w:before="120"/>
       </w:pPr>
       <w:r>
@@ -8972,6 +9750,7 @@
     <w:p>
       <w:pPr>
         <w:pStyle w:val="Heading3"/>
+        <w:keepNext/>
         <w:spacing w:after="80" w:before="160"/>
       </w:pPr>
       <w:r>
@@ -8983,22 +9762,6 @@
           <w:szCs w:val="22"/>
         </w:rPr>
         <w:t xml:space="preserve">A1. Main Workflows</w:t>
-      </w:r>
-    </w:p>
-    <w:p>
-      <w:pPr>
-        <w:spacing w:after="80"/>
-      </w:pPr>
-      <w:r>
-        <w:rPr>
-          <w:rFonts w:ascii="Calibri" w:cs="Calibri" w:eastAsia="Calibri" w:hAnsi="Calibri"/>
-          <w:i/>
-          <w:iCs/>
-          <w:color w:val="666666"/>
-          <w:sz w:val="19"/>
-          <w:szCs w:val="19"/>
-        </w:rPr>
-        <w:t xml:space="preserve">Minimum number = number of team members. A valid workflow involves at least 2 actors or at least 3 mandatory features, and changes the state of at least one main entity.</w:t>
       </w:r>
     </w:p>
     <w:tbl>
@@ -9545,7 +10308,7 @@
                 <w:sz w:val="15"/>
                 <w:szCs w:val="19"/>
               </w:rPr>
-              <w:t>[Owner]</w:t>
+              <w:t>Thuận</w:t>
             </w:r>
           </w:p>
         </w:tc>
@@ -9803,7 +10566,7 @@
                 <w:sz w:val="15"/>
                 <w:szCs w:val="19"/>
               </w:rPr>
-              <w:t>[Owner]</w:t>
+              <w:t>Phượng</w:t>
             </w:r>
           </w:p>
         </w:tc>
@@ -10061,7 +10824,7 @@
                 <w:sz w:val="15"/>
                 <w:szCs w:val="19"/>
               </w:rPr>
-              <w:t>[Owner]</w:t>
+              <w:t>Việt</w:t>
             </w:r>
           </w:p>
         </w:tc>
@@ -10319,7 +11082,7 @@
                 <w:sz w:val="15"/>
                 <w:szCs w:val="19"/>
               </w:rPr>
-              <w:t>[Owner]</w:t>
+              <w:t>Thuận</w:t>
             </w:r>
           </w:p>
         </w:tc>
@@ -10577,7 +11340,7 @@
                 <w:sz w:val="15"/>
                 <w:szCs w:val="19"/>
               </w:rPr>
-              <w:t>[Owner]</w:t>
+              <w:t>Thi</w:t>
             </w:r>
           </w:p>
         </w:tc>
@@ -10835,7 +11598,7 @@
                 <w:sz w:val="15"/>
                 <w:szCs w:val="19"/>
               </w:rPr>
-              <w:t>[Owner]</w:t>
+              <w:t>Thi</w:t>
             </w:r>
           </w:p>
         </w:tc>
@@ -10844,6 +11607,7 @@
     <w:p>
       <w:pPr>
         <w:pStyle w:val="Heading3"/>
+        <w:keepNext/>
         <w:spacing w:after="80" w:before="160"/>
       </w:pPr>
       <w:r>
@@ -10855,22 +11619,6 @@
           <w:szCs w:val="22"/>
         </w:rPr>
         <w:t xml:space="preserve">A2. Demo Scenarios</w:t>
-      </w:r>
-    </w:p>
-    <w:p>
-      <w:pPr>
-        <w:spacing w:after="80"/>
-      </w:pPr>
-      <w:r>
-        <w:rPr>
-          <w:rFonts w:ascii="Calibri" w:cs="Calibri" w:eastAsia="Calibri" w:hAnsi="Calibri"/>
-          <w:i/>
-          <w:iCs/>
-          <w:color w:val="666666"/>
-          <w:sz w:val="19"/>
-          <w:szCs w:val="19"/>
-        </w:rPr>
-        <w:t xml:space="preserve">Per workflow: at least 1 main scenario and 1 exception scenario. Run on staging with seeded data.</w:t>
       </w:r>
     </w:p>
     <w:tbl>
@@ -11351,7 +12099,7 @@
                 <w:sz w:val="15"/>
                 <w:szCs w:val="19"/>
               </w:rPr>
-              <w:t>[Presenter]</w:t>
+              <w:t>Thuận</w:t>
             </w:r>
           </w:p>
         </w:tc>
@@ -11577,7 +12325,7 @@
                 <w:sz w:val="15"/>
                 <w:szCs w:val="19"/>
               </w:rPr>
-              <w:t>[Presenter]</w:t>
+              <w:t>Thuận</w:t>
             </w:r>
           </w:p>
         </w:tc>
@@ -11803,7 +12551,7 @@
                 <w:sz w:val="15"/>
                 <w:szCs w:val="19"/>
               </w:rPr>
-              <w:t>[Presenter]</w:t>
+              <w:t>Phượng</w:t>
             </w:r>
           </w:p>
         </w:tc>
@@ -12029,7 +12777,7 @@
                 <w:sz w:val="15"/>
                 <w:szCs w:val="19"/>
               </w:rPr>
-              <w:t>[Presenter]</w:t>
+              <w:t>Phượng</w:t>
             </w:r>
           </w:p>
         </w:tc>
@@ -12255,7 +13003,7 @@
                 <w:sz w:val="15"/>
                 <w:szCs w:val="19"/>
               </w:rPr>
-              <w:t>[Presenter]</w:t>
+              <w:t>Việt</w:t>
             </w:r>
           </w:p>
         </w:tc>
@@ -12481,7 +13229,7 @@
                 <w:sz w:val="15"/>
                 <w:szCs w:val="19"/>
               </w:rPr>
-              <w:t>[Presenter]</w:t>
+              <w:t>Việt</w:t>
             </w:r>
           </w:p>
         </w:tc>
@@ -12707,7 +13455,7 @@
                 <w:sz w:val="15"/>
                 <w:szCs w:val="19"/>
               </w:rPr>
-              <w:t>[Presenter]</w:t>
+              <w:t>Thuận</w:t>
             </w:r>
           </w:p>
         </w:tc>
@@ -12933,7 +13681,7 @@
                 <w:sz w:val="15"/>
                 <w:szCs w:val="19"/>
               </w:rPr>
-              <w:t>[Presenter]</w:t>
+              <w:t>Thuận</w:t>
             </w:r>
           </w:p>
         </w:tc>
@@ -13159,7 +13907,7 @@
                 <w:sz w:val="15"/>
                 <w:szCs w:val="19"/>
               </w:rPr>
-              <w:t>[Presenter]</w:t>
+              <w:t>Thi</w:t>
             </w:r>
           </w:p>
         </w:tc>
@@ -13385,7 +14133,7 @@
                 <w:sz w:val="15"/>
                 <w:szCs w:val="19"/>
               </w:rPr>
-              <w:t>[Presenter]</w:t>
+              <w:t>Thi</w:t>
             </w:r>
           </w:p>
         </w:tc>
@@ -13611,7 +14359,7 @@
                 <w:sz w:val="15"/>
                 <w:szCs w:val="19"/>
               </w:rPr>
-              <w:t>[Presenter]</w:t>
+              <w:t>Thi</w:t>
             </w:r>
           </w:p>
         </w:tc>
@@ -13837,7 +14585,7 @@
                 <w:sz w:val="15"/>
                 <w:szCs w:val="19"/>
               </w:rPr>
-              <w:t>[Presenter]</w:t>
+              <w:t>Thi</w:t>
             </w:r>
           </w:p>
         </w:tc>
@@ -13846,6 +14594,7 @@
     <w:p>
       <w:pPr>
         <w:pStyle w:val="Heading3"/>
+        <w:keepNext/>
         <w:spacing w:after="80" w:before="160"/>
       </w:pPr>
       <w:r>
@@ -14335,7 +15084,7 @@
                 <w:sz w:val="16"/>
                 <w:szCs w:val="19"/>
               </w:rPr>
-              <w:t>[count]</w:t>
+              <w:t>33</w:t>
             </w:r>
           </w:p>
         </w:tc>
@@ -14399,7 +15148,7 @@
                 <w:sz w:val="16"/>
                 <w:szCs w:val="19"/>
               </w:rPr>
-              <w:t>[count]</w:t>
+              <w:t>33</w:t>
             </w:r>
           </w:p>
         </w:tc>
@@ -14657,7 +15406,7 @@
                 <w:sz w:val="16"/>
                 <w:szCs w:val="19"/>
               </w:rPr>
-              <w:t>[sum]</w:t>
+              <w:t>75</w:t>
             </w:r>
           </w:p>
         </w:tc>

</xml_diff>